<commit_message>
add tasks for topic 06
</commit_message>
<xml_diff>
--- a/TP-KB-241-Shchuchkin-Pavlo-lpr.docx
+++ b/TP-KB-241-Shchuchkin-Pavlo-lpr.docx
@@ -10708,9 +10708,6 @@
         </w:pBdr>
         <w:spacing w:line="259" w:lineRule="auto"/>
         <w:jc w:val="left"/>
-        <w:rPr>
-          <w:lang w:val="ru-RU"/>
-        </w:rPr>
       </w:pPr>
       <w:r>
         <w:t xml:space="preserve">        </w:t>
@@ -10720,16 +10717,10 @@
         <w:t>print</w:t>
       </w:r>
       <w:r>
-        <w:rPr>
-          <w:lang w:val="ru-RU"/>
-        </w:rPr>
         <w:t>(</w:t>
       </w:r>
       <w:proofErr w:type="gramEnd"/>
       <w:r>
-        <w:rPr>
-          <w:lang w:val="ru-RU"/>
-        </w:rPr>
         <w:t>"</w:t>
       </w:r>
       <w:proofErr w:type="spellStart"/>
@@ -10741,10 +10732,34 @@
       </w:r>
       <w:proofErr w:type="spellEnd"/>
       <w:r>
-        <w:rPr>
-          <w:lang w:val="ru-RU"/>
-        </w:rPr>
-        <w:t xml:space="preserve"> на нуль не </w:t>
+        <w:t xml:space="preserve"> </w:t>
+      </w:r>
+      <w:r>
+        <w:rPr>
+          <w:lang w:val="ru-RU"/>
+        </w:rPr>
+        <w:t>на</w:t>
+      </w:r>
+      <w:r>
+        <w:t xml:space="preserve"> </w:t>
+      </w:r>
+      <w:r>
+        <w:rPr>
+          <w:lang w:val="ru-RU"/>
+        </w:rPr>
+        <w:t>нуль</w:t>
+      </w:r>
+      <w:r>
+        <w:t xml:space="preserve"> </w:t>
+      </w:r>
+      <w:r>
+        <w:rPr>
+          <w:lang w:val="ru-RU"/>
+        </w:rPr>
+        <w:t>не</w:t>
+      </w:r>
+      <w:r>
+        <w:t xml:space="preserve"> </w:t>
       </w:r>
       <w:proofErr w:type="spellStart"/>
       <w:r>
@@ -10755,9 +10770,6 @@
       </w:r>
       <w:proofErr w:type="spellEnd"/>
       <w:r>
-        <w:rPr>
-          <w:lang w:val="ru-RU"/>
-        </w:rPr>
         <w:t>")</w:t>
       </w:r>
     </w:p>
@@ -13349,9 +13361,10 @@
       <w:r>
         <w:rPr>
           <w:rFonts w:cs="Times New Roman"/>
+          <w:noProof/>
           <w:color w:val="000000" w:themeColor="text1"/>
           <w:szCs w:val="28"/>
-          <w:lang w:val="uk-UA"/>
+          <w:lang w:val="uk-UA" w:eastAsia="uk-UA"/>
         </w:rPr>
         <w:drawing>
           <wp:inline distT="0" distB="0" distL="0" distR="0" wp14:anchorId="7F0D9F6C" wp14:editId="48A9E4E0">
@@ -14379,7 +14392,8 @@
       </w:pPr>
       <w:r>
         <w:rPr>
-          <w:lang w:val="uk-UA"/>
+          <w:noProof/>
+          <w:lang w:val="uk-UA" w:eastAsia="uk-UA"/>
         </w:rPr>
         <w:drawing>
           <wp:inline distT="0" distB="0" distL="0" distR="0" wp14:anchorId="1FBD40A9" wp14:editId="3A6650C3">
@@ -16388,8 +16402,9 @@
       <w:r>
         <w:rPr>
           <w:rFonts w:cs="Times New Roman"/>
-          <w:szCs w:val="28"/>
-          <w:lang w:val="uk-UA"/>
+          <w:noProof/>
+          <w:szCs w:val="28"/>
+          <w:lang w:val="uk-UA" w:eastAsia="uk-UA"/>
         </w:rPr>
         <w:drawing>
           <wp:inline distT="0" distB="0" distL="0" distR="0" wp14:anchorId="6B7A0D46" wp14:editId="445C16F0">
@@ -16458,34 +16473,4212 @@
           <w:lang w:val="ru-RU"/>
         </w:rPr>
       </w:pPr>
-      <w:r>
-        <w:rPr>
-          <w:lang w:val="ru-RU"/>
-        </w:rPr>
-        <w:t>https://github.com/PavelSanguinary/TP-KB-241-Pavlo-Shchuchkin.git</w:t>
-      </w:r>
-    </w:p>
-    <w:p>
-      <w:pPr>
-        <w:spacing w:after="0"/>
-        <w:rPr>
-          <w:rFonts w:cs="Times New Roman"/>
-          <w:szCs w:val="28"/>
-          <w:lang w:val="ru-RU"/>
-        </w:rPr>
-      </w:pPr>
+      <w:hyperlink r:id="rId22" w:history="1">
+        <w:r>
+          <w:rPr>
+            <w:rStyle w:val="a5"/>
+            <w:lang w:val="ru-RU"/>
+          </w:rPr>
+          <w:t>https://github.com/PavelSanguinary/TP-KB-241-Pavlo-Shchuchkin.git</w:t>
+        </w:r>
+      </w:hyperlink>
+    </w:p>
+    <w:p>
+      <w:pPr>
+        <w:rPr>
+          <w:lang w:val="ru-RU"/>
+        </w:rPr>
+      </w:pPr>
+      <w:r>
+        <w:rPr>
+          <w:lang w:val="uk-UA"/>
+        </w:rPr>
+        <w:lastRenderedPageBreak/>
+        <w:t xml:space="preserve">Знімок екрану з посилання на </w:t>
+      </w:r>
+      <w:proofErr w:type="spellStart"/>
+      <w:r>
+        <w:t>github</w:t>
+      </w:r>
+      <w:proofErr w:type="spellEnd"/>
+      <w:r>
+        <w:rPr>
+          <w:lang w:val="ru-RU"/>
+        </w:rPr>
+        <w:t>:</w:t>
+      </w:r>
+    </w:p>
+    <w:p>
+      <w:pPr>
+        <w:spacing w:after="0"/>
+        <w:rPr>
+          <w:rFonts w:cs="Times New Roman"/>
+          <w:szCs w:val="28"/>
+          <w:lang w:val="ru-RU"/>
+        </w:rPr>
+      </w:pPr>
+      <w:r>
+        <w:rPr>
+          <w:rFonts w:cs="Times New Roman"/>
+          <w:noProof/>
+          <w:szCs w:val="28"/>
+          <w:lang w:val="uk-UA" w:eastAsia="uk-UA"/>
+        </w:rPr>
+        <w:drawing>
+          <wp:inline distT="0" distB="0" distL="0" distR="0" wp14:anchorId="18B872E6" wp14:editId="25F3CBE9">
+            <wp:extent cx="5943600" cy="2511425"/>
+            <wp:effectExtent l="0" t="0" r="0" b="3175"/>
+            <wp:docPr id="4" name="Рисунок 4"/>
+            <wp:cNvGraphicFramePr>
+              <a:graphicFrameLocks xmlns:a="http://schemas.openxmlformats.org/drawingml/2006/main" noChangeAspect="1"/>
+            </wp:cNvGraphicFramePr>
+            <a:graphic xmlns:a="http://schemas.openxmlformats.org/drawingml/2006/main">
+              <a:graphicData uri="http://schemas.openxmlformats.org/drawingml/2006/picture">
+                <pic:pic xmlns:pic="http://schemas.openxmlformats.org/drawingml/2006/picture">
+                  <pic:nvPicPr>
+                    <pic:cNvPr id="1" name=""/>
+                    <pic:cNvPicPr/>
+                  </pic:nvPicPr>
+                  <pic:blipFill>
+                    <a:blip r:embed="rId23"/>
+                    <a:stretch>
+                      <a:fillRect/>
+                    </a:stretch>
+                  </pic:blipFill>
+                  <pic:spPr>
+                    <a:xfrm>
+                      <a:off x="0" y="0"/>
+                      <a:ext cx="5943600" cy="2511425"/>
+                    </a:xfrm>
+                    <a:prstGeom prst="rect">
+                      <a:avLst/>
+                    </a:prstGeom>
+                  </pic:spPr>
+                </pic:pic>
+              </a:graphicData>
+            </a:graphic>
+          </wp:inline>
+        </w:drawing>
+      </w:r>
+    </w:p>
+    <w:p>
+      <w:pPr>
+        <w:spacing w:line="259" w:lineRule="auto"/>
+        <w:ind w:firstLine="0"/>
+        <w:jc w:val="left"/>
+        <w:rPr>
+          <w:rFonts w:cs="Times New Roman"/>
+          <w:szCs w:val="28"/>
+          <w:lang w:val="uk-UA"/>
+        </w:rPr>
+      </w:pPr>
+      <w:r>
+        <w:rPr>
+          <w:rFonts w:cs="Times New Roman"/>
+          <w:szCs w:val="28"/>
+          <w:lang w:val="uk-UA"/>
+        </w:rPr>
+        <w:br w:type="page"/>
+      </w:r>
+    </w:p>
+    <w:p>
+      <w:pPr>
+        <w:spacing w:after="0"/>
+        <w:ind w:firstLine="709"/>
+        <w:jc w:val="center"/>
+        <w:rPr>
+          <w:rFonts w:cs="Times New Roman"/>
+          <w:b/>
+          <w:bCs/>
+          <w:szCs w:val="28"/>
+          <w:lang w:val="ru-RU"/>
+        </w:rPr>
+      </w:pPr>
+      <w:r>
+        <w:rPr>
+          <w:rFonts w:cs="Times New Roman"/>
+          <w:b/>
+          <w:bCs/>
+          <w:szCs w:val="28"/>
+          <w:lang w:val="uk-UA"/>
+        </w:rPr>
+        <w:lastRenderedPageBreak/>
+        <w:t xml:space="preserve">Звіт про виконання практичних завдань до лекцій з курсу Технології програмування на мові </w:t>
+      </w:r>
+      <w:r>
+        <w:rPr>
+          <w:rFonts w:cs="Times New Roman"/>
+          <w:b/>
+          <w:bCs/>
+          <w:szCs w:val="28"/>
+        </w:rPr>
+        <w:t>Python</w:t>
+      </w:r>
+    </w:p>
+    <w:p>
+      <w:pPr>
+        <w:spacing w:after="0"/>
+        <w:ind w:firstLine="709"/>
+        <w:rPr>
+          <w:rFonts w:cs="Times New Roman"/>
+          <w:szCs w:val="28"/>
+          <w:lang w:val="ru-RU"/>
+        </w:rPr>
+      </w:pPr>
+    </w:p>
+    <w:p>
+      <w:pPr>
+        <w:spacing w:after="0"/>
+        <w:ind w:firstLine="709"/>
+        <w:rPr>
+          <w:rFonts w:cs="Times New Roman"/>
+          <w:szCs w:val="28"/>
+          <w:lang w:val="ru-RU"/>
+        </w:rPr>
+      </w:pPr>
+    </w:p>
+    <w:p>
+      <w:pPr>
+        <w:spacing w:after="0"/>
+        <w:ind w:firstLine="709"/>
+        <w:jc w:val="right"/>
+        <w:rPr>
+          <w:rFonts w:cs="Times New Roman"/>
+          <w:szCs w:val="28"/>
+          <w:lang w:val="uk-UA"/>
+        </w:rPr>
+      </w:pPr>
+      <w:r>
+        <w:rPr>
+          <w:rFonts w:cs="Times New Roman"/>
+          <w:szCs w:val="28"/>
+          <w:lang w:val="uk-UA"/>
+        </w:rPr>
+        <w:t>Звіт до Теми №</w:t>
+      </w:r>
+      <w:r>
+        <w:rPr>
+          <w:rFonts w:cs="Times New Roman"/>
+          <w:szCs w:val="28"/>
+          <w:lang w:val="uk-UA"/>
+        </w:rPr>
+        <w:t>6</w:t>
+      </w:r>
+    </w:p>
+    <w:p>
+      <w:pPr>
+        <w:spacing w:after="0"/>
+        <w:jc w:val="right"/>
+        <w:rPr>
+          <w:rFonts w:cs="Times New Roman"/>
+          <w:szCs w:val="28"/>
+          <w:lang w:val="uk-UA"/>
+        </w:rPr>
+      </w:pPr>
+      <w:r>
+        <w:rPr>
+          <w:rFonts w:cs="Times New Roman"/>
+          <w:szCs w:val="28"/>
+          <w:lang w:val="uk-UA"/>
+        </w:rPr>
+        <w:t>Робота з файлами</w:t>
+      </w:r>
+    </w:p>
+    <w:p>
+      <w:pPr>
+        <w:spacing w:after="0"/>
+        <w:ind w:firstLine="709"/>
+        <w:rPr>
+          <w:rFonts w:cs="Times New Roman"/>
+          <w:szCs w:val="28"/>
+          <w:lang w:val="uk-UA"/>
+        </w:rPr>
+      </w:pPr>
+      <w:r>
+        <w:rPr>
+          <w:rFonts w:cs="Times New Roman"/>
+          <w:szCs w:val="28"/>
+          <w:lang w:val="uk-UA"/>
+        </w:rPr>
+        <w:t>Під час виконання практичного завдання до Теми №</w:t>
+      </w:r>
+      <w:r>
+        <w:rPr>
+          <w:rFonts w:cs="Times New Roman"/>
+          <w:szCs w:val="28"/>
+          <w:lang w:val="uk-UA"/>
+        </w:rPr>
+        <w:t>6</w:t>
+      </w:r>
+      <w:r>
+        <w:rPr>
+          <w:rFonts w:cs="Times New Roman"/>
+          <w:szCs w:val="28"/>
+          <w:lang w:val="uk-UA"/>
+        </w:rPr>
+        <w:t xml:space="preserve"> було надано варіанти рішення до наступних задач:</w:t>
+      </w:r>
+    </w:p>
+    <w:p>
+      <w:pPr>
+        <w:pStyle w:val="a4"/>
+        <w:numPr>
+          <w:ilvl w:val="0"/>
+          <w:numId w:val="7"/>
+        </w:numPr>
+        <w:spacing w:after="0"/>
+        <w:rPr>
+          <w:rFonts w:cs="Times New Roman"/>
+          <w:szCs w:val="28"/>
+          <w:lang w:val="uk-UA"/>
+        </w:rPr>
+      </w:pPr>
+      <w:r>
+        <w:rPr>
+          <w:lang w:val="uk-UA"/>
+        </w:rPr>
+        <w:t>М</w:t>
+      </w:r>
+      <w:r>
+        <w:rPr>
+          <w:lang w:val="uk-UA"/>
+        </w:rPr>
+        <w:t xml:space="preserve">еханізм </w:t>
+      </w:r>
+      <w:proofErr w:type="spellStart"/>
+      <w:r>
+        <w:rPr>
+          <w:lang w:val="uk-UA"/>
+        </w:rPr>
+        <w:t>логування</w:t>
+      </w:r>
+      <w:proofErr w:type="spellEnd"/>
+    </w:p>
+    <w:p>
+      <w:pPr>
+        <w:spacing w:after="0"/>
+        <w:rPr>
+          <w:b/>
+          <w:lang w:val="uk-UA"/>
+        </w:rPr>
+      </w:pPr>
+      <w:r>
+        <w:rPr>
+          <w:b/>
+          <w:lang w:val="uk-UA"/>
+        </w:rPr>
+        <w:t>calc.py</w:t>
+      </w:r>
+    </w:p>
+    <w:p>
+      <w:pPr>
+        <w:pBdr>
+          <w:top w:val="single" w:sz="4" w:space="1" w:color="auto"/>
+          <w:left w:val="single" w:sz="4" w:space="4" w:color="auto"/>
+          <w:bottom w:val="single" w:sz="4" w:space="1" w:color="auto"/>
+          <w:right w:val="single" w:sz="4" w:space="4" w:color="auto"/>
+        </w:pBdr>
+        <w:spacing w:after="0"/>
+        <w:rPr>
+          <w:lang w:val="uk-UA"/>
+        </w:rPr>
+      </w:pPr>
+      <w:proofErr w:type="spellStart"/>
+      <w:r>
+        <w:rPr>
+          <w:lang w:val="uk-UA"/>
+        </w:rPr>
+        <w:t>from</w:t>
+      </w:r>
+      <w:proofErr w:type="spellEnd"/>
+      <w:r>
+        <w:rPr>
+          <w:lang w:val="uk-UA"/>
+        </w:rPr>
+        <w:t xml:space="preserve"> </w:t>
+      </w:r>
+      <w:proofErr w:type="spellStart"/>
+      <w:r>
+        <w:rPr>
+          <w:lang w:val="uk-UA"/>
+        </w:rPr>
+        <w:t>operations</w:t>
+      </w:r>
+      <w:proofErr w:type="spellEnd"/>
+      <w:r>
+        <w:rPr>
+          <w:lang w:val="uk-UA"/>
+        </w:rPr>
+        <w:t xml:space="preserve"> </w:t>
+      </w:r>
+      <w:proofErr w:type="spellStart"/>
+      <w:r>
+        <w:rPr>
+          <w:lang w:val="uk-UA"/>
+        </w:rPr>
+        <w:t>import</w:t>
+      </w:r>
+      <w:proofErr w:type="spellEnd"/>
+      <w:r>
+        <w:rPr>
+          <w:lang w:val="uk-UA"/>
+        </w:rPr>
+        <w:t xml:space="preserve"> </w:t>
+      </w:r>
+      <w:proofErr w:type="spellStart"/>
+      <w:r>
+        <w:rPr>
+          <w:lang w:val="uk-UA"/>
+        </w:rPr>
+        <w:t>run_calculator</w:t>
+      </w:r>
+      <w:proofErr w:type="spellEnd"/>
+    </w:p>
+    <w:p>
+      <w:pPr>
+        <w:pBdr>
+          <w:top w:val="single" w:sz="4" w:space="1" w:color="auto"/>
+          <w:left w:val="single" w:sz="4" w:space="4" w:color="auto"/>
+          <w:bottom w:val="single" w:sz="4" w:space="1" w:color="auto"/>
+          <w:right w:val="single" w:sz="4" w:space="4" w:color="auto"/>
+        </w:pBdr>
+        <w:spacing w:after="0"/>
+        <w:rPr>
+          <w:lang w:val="uk-UA"/>
+        </w:rPr>
+      </w:pPr>
+    </w:p>
+    <w:p>
+      <w:pPr>
+        <w:pBdr>
+          <w:top w:val="single" w:sz="4" w:space="1" w:color="auto"/>
+          <w:left w:val="single" w:sz="4" w:space="4" w:color="auto"/>
+          <w:bottom w:val="single" w:sz="4" w:space="1" w:color="auto"/>
+          <w:right w:val="single" w:sz="4" w:space="4" w:color="auto"/>
+        </w:pBdr>
+        <w:spacing w:after="0"/>
+        <w:rPr>
+          <w:lang w:val="uk-UA"/>
+        </w:rPr>
+      </w:pPr>
+      <w:proofErr w:type="spellStart"/>
+      <w:r>
+        <w:rPr>
+          <w:lang w:val="uk-UA"/>
+        </w:rPr>
+        <w:t>run_calculator</w:t>
+      </w:r>
+      <w:proofErr w:type="spellEnd"/>
+      <w:r>
+        <w:rPr>
+          <w:lang w:val="uk-UA"/>
+        </w:rPr>
+        <w:t>()</w:t>
+      </w:r>
+    </w:p>
+    <w:p>
+      <w:pPr>
+        <w:spacing w:after="0"/>
+        <w:rPr>
+          <w:b/>
+          <w:lang w:val="uk-UA"/>
+        </w:rPr>
+      </w:pPr>
+      <w:r>
+        <w:rPr>
+          <w:b/>
+          <w:lang w:val="uk-UA"/>
+        </w:rPr>
+        <w:t>functions.py</w:t>
+      </w:r>
+    </w:p>
+    <w:p>
+      <w:pPr>
+        <w:pBdr>
+          <w:top w:val="single" w:sz="4" w:space="1" w:color="auto"/>
+          <w:left w:val="single" w:sz="4" w:space="4" w:color="auto"/>
+          <w:bottom w:val="single" w:sz="4" w:space="1" w:color="auto"/>
+          <w:right w:val="single" w:sz="4" w:space="4" w:color="auto"/>
+        </w:pBdr>
+        <w:spacing w:after="0"/>
+        <w:rPr>
+          <w:lang w:val="uk-UA"/>
+        </w:rPr>
+      </w:pPr>
+      <w:proofErr w:type="spellStart"/>
+      <w:r>
+        <w:rPr>
+          <w:lang w:val="uk-UA"/>
+        </w:rPr>
+        <w:t>def</w:t>
+      </w:r>
+      <w:proofErr w:type="spellEnd"/>
+      <w:r>
+        <w:rPr>
+          <w:lang w:val="uk-UA"/>
+        </w:rPr>
+        <w:t xml:space="preserve"> </w:t>
+      </w:r>
+      <w:proofErr w:type="spellStart"/>
+      <w:r>
+        <w:rPr>
+          <w:lang w:val="uk-UA"/>
+        </w:rPr>
+        <w:t>plus</w:t>
+      </w:r>
+      <w:proofErr w:type="spellEnd"/>
+      <w:r>
+        <w:rPr>
+          <w:lang w:val="uk-UA"/>
+        </w:rPr>
+        <w:t>(a, b):</w:t>
+      </w:r>
+    </w:p>
+    <w:p>
+      <w:pPr>
+        <w:pBdr>
+          <w:top w:val="single" w:sz="4" w:space="1" w:color="auto"/>
+          <w:left w:val="single" w:sz="4" w:space="4" w:color="auto"/>
+          <w:bottom w:val="single" w:sz="4" w:space="1" w:color="auto"/>
+          <w:right w:val="single" w:sz="4" w:space="4" w:color="auto"/>
+        </w:pBdr>
+        <w:spacing w:after="0"/>
+        <w:rPr>
+          <w:lang w:val="uk-UA"/>
+        </w:rPr>
+      </w:pPr>
+      <w:r>
+        <w:rPr>
+          <w:lang w:val="uk-UA"/>
+        </w:rPr>
+        <w:t xml:space="preserve">    </w:t>
+      </w:r>
+      <w:proofErr w:type="spellStart"/>
+      <w:r>
+        <w:rPr>
+          <w:lang w:val="uk-UA"/>
+        </w:rPr>
+        <w:t>return</w:t>
+      </w:r>
+      <w:proofErr w:type="spellEnd"/>
+      <w:r>
+        <w:rPr>
+          <w:lang w:val="uk-UA"/>
+        </w:rPr>
+        <w:t xml:space="preserve"> a + b</w:t>
+      </w:r>
+    </w:p>
+    <w:p>
+      <w:pPr>
+        <w:pBdr>
+          <w:top w:val="single" w:sz="4" w:space="1" w:color="auto"/>
+          <w:left w:val="single" w:sz="4" w:space="4" w:color="auto"/>
+          <w:bottom w:val="single" w:sz="4" w:space="1" w:color="auto"/>
+          <w:right w:val="single" w:sz="4" w:space="4" w:color="auto"/>
+        </w:pBdr>
+        <w:spacing w:after="0"/>
+        <w:rPr>
+          <w:lang w:val="uk-UA"/>
+        </w:rPr>
+      </w:pPr>
+    </w:p>
+    <w:p>
+      <w:pPr>
+        <w:pBdr>
+          <w:top w:val="single" w:sz="4" w:space="1" w:color="auto"/>
+          <w:left w:val="single" w:sz="4" w:space="4" w:color="auto"/>
+          <w:bottom w:val="single" w:sz="4" w:space="1" w:color="auto"/>
+          <w:right w:val="single" w:sz="4" w:space="4" w:color="auto"/>
+        </w:pBdr>
+        <w:spacing w:after="0"/>
+        <w:rPr>
+          <w:lang w:val="uk-UA"/>
+        </w:rPr>
+      </w:pPr>
+      <w:proofErr w:type="spellStart"/>
+      <w:r>
+        <w:rPr>
+          <w:lang w:val="uk-UA"/>
+        </w:rPr>
+        <w:t>def</w:t>
+      </w:r>
+      <w:proofErr w:type="spellEnd"/>
+      <w:r>
+        <w:rPr>
+          <w:lang w:val="uk-UA"/>
+        </w:rPr>
+        <w:t xml:space="preserve"> </w:t>
+      </w:r>
+      <w:proofErr w:type="spellStart"/>
+      <w:r>
+        <w:rPr>
+          <w:lang w:val="uk-UA"/>
+        </w:rPr>
+        <w:t>minus</w:t>
+      </w:r>
+      <w:proofErr w:type="spellEnd"/>
+      <w:r>
+        <w:rPr>
+          <w:lang w:val="uk-UA"/>
+        </w:rPr>
+        <w:t>(a, b):</w:t>
+      </w:r>
+    </w:p>
+    <w:p>
+      <w:pPr>
+        <w:pBdr>
+          <w:top w:val="single" w:sz="4" w:space="1" w:color="auto"/>
+          <w:left w:val="single" w:sz="4" w:space="4" w:color="auto"/>
+          <w:bottom w:val="single" w:sz="4" w:space="1" w:color="auto"/>
+          <w:right w:val="single" w:sz="4" w:space="4" w:color="auto"/>
+        </w:pBdr>
+        <w:spacing w:after="0"/>
+        <w:rPr>
+          <w:lang w:val="uk-UA"/>
+        </w:rPr>
+      </w:pPr>
+      <w:r>
+        <w:rPr>
+          <w:lang w:val="uk-UA"/>
+        </w:rPr>
+        <w:t xml:space="preserve">    </w:t>
+      </w:r>
+      <w:proofErr w:type="spellStart"/>
+      <w:r>
+        <w:rPr>
+          <w:lang w:val="uk-UA"/>
+        </w:rPr>
+        <w:t>return</w:t>
+      </w:r>
+      <w:proofErr w:type="spellEnd"/>
+      <w:r>
+        <w:rPr>
+          <w:lang w:val="uk-UA"/>
+        </w:rPr>
+        <w:t xml:space="preserve"> a - b</w:t>
+      </w:r>
+    </w:p>
+    <w:p>
+      <w:pPr>
+        <w:pBdr>
+          <w:top w:val="single" w:sz="4" w:space="1" w:color="auto"/>
+          <w:left w:val="single" w:sz="4" w:space="4" w:color="auto"/>
+          <w:bottom w:val="single" w:sz="4" w:space="1" w:color="auto"/>
+          <w:right w:val="single" w:sz="4" w:space="4" w:color="auto"/>
+        </w:pBdr>
+        <w:spacing w:after="0"/>
+        <w:rPr>
+          <w:lang w:val="uk-UA"/>
+        </w:rPr>
+      </w:pPr>
+    </w:p>
+    <w:p>
+      <w:pPr>
+        <w:pBdr>
+          <w:top w:val="single" w:sz="4" w:space="1" w:color="auto"/>
+          <w:left w:val="single" w:sz="4" w:space="4" w:color="auto"/>
+          <w:bottom w:val="single" w:sz="4" w:space="1" w:color="auto"/>
+          <w:right w:val="single" w:sz="4" w:space="4" w:color="auto"/>
+        </w:pBdr>
+        <w:spacing w:after="0"/>
+        <w:rPr>
+          <w:lang w:val="uk-UA"/>
+        </w:rPr>
+      </w:pPr>
+      <w:proofErr w:type="spellStart"/>
+      <w:r>
+        <w:rPr>
+          <w:lang w:val="uk-UA"/>
+        </w:rPr>
+        <w:t>def</w:t>
+      </w:r>
+      <w:proofErr w:type="spellEnd"/>
+      <w:r>
+        <w:rPr>
+          <w:lang w:val="uk-UA"/>
+        </w:rPr>
+        <w:t xml:space="preserve"> </w:t>
+      </w:r>
+      <w:proofErr w:type="spellStart"/>
+      <w:r>
+        <w:rPr>
+          <w:lang w:val="uk-UA"/>
+        </w:rPr>
+        <w:t>mnoj</w:t>
+      </w:r>
+      <w:proofErr w:type="spellEnd"/>
+      <w:r>
+        <w:rPr>
+          <w:lang w:val="uk-UA"/>
+        </w:rPr>
+        <w:t>(a, b):</w:t>
+      </w:r>
+    </w:p>
+    <w:p>
+      <w:pPr>
+        <w:pBdr>
+          <w:top w:val="single" w:sz="4" w:space="1" w:color="auto"/>
+          <w:left w:val="single" w:sz="4" w:space="4" w:color="auto"/>
+          <w:bottom w:val="single" w:sz="4" w:space="1" w:color="auto"/>
+          <w:right w:val="single" w:sz="4" w:space="4" w:color="auto"/>
+        </w:pBdr>
+        <w:spacing w:after="0"/>
+        <w:rPr>
+          <w:lang w:val="uk-UA"/>
+        </w:rPr>
+      </w:pPr>
+      <w:r>
+        <w:rPr>
+          <w:lang w:val="uk-UA"/>
+        </w:rPr>
+        <w:t xml:space="preserve">    </w:t>
+      </w:r>
+      <w:proofErr w:type="spellStart"/>
+      <w:r>
+        <w:rPr>
+          <w:lang w:val="uk-UA"/>
+        </w:rPr>
+        <w:t>return</w:t>
+      </w:r>
+      <w:proofErr w:type="spellEnd"/>
+      <w:r>
+        <w:rPr>
+          <w:lang w:val="uk-UA"/>
+        </w:rPr>
+        <w:t xml:space="preserve"> a * b</w:t>
+      </w:r>
+    </w:p>
+    <w:p>
+      <w:pPr>
+        <w:pBdr>
+          <w:top w:val="single" w:sz="4" w:space="1" w:color="auto"/>
+          <w:left w:val="single" w:sz="4" w:space="4" w:color="auto"/>
+          <w:bottom w:val="single" w:sz="4" w:space="1" w:color="auto"/>
+          <w:right w:val="single" w:sz="4" w:space="4" w:color="auto"/>
+        </w:pBdr>
+        <w:spacing w:after="0"/>
+        <w:rPr>
+          <w:lang w:val="uk-UA"/>
+        </w:rPr>
+      </w:pPr>
+    </w:p>
+    <w:p>
+      <w:pPr>
+        <w:pBdr>
+          <w:top w:val="single" w:sz="4" w:space="1" w:color="auto"/>
+          <w:left w:val="single" w:sz="4" w:space="4" w:color="auto"/>
+          <w:bottom w:val="single" w:sz="4" w:space="1" w:color="auto"/>
+          <w:right w:val="single" w:sz="4" w:space="4" w:color="auto"/>
+        </w:pBdr>
+        <w:spacing w:after="0"/>
+        <w:rPr>
+          <w:lang w:val="uk-UA"/>
+        </w:rPr>
+      </w:pPr>
+      <w:proofErr w:type="spellStart"/>
+      <w:r>
+        <w:rPr>
+          <w:lang w:val="uk-UA"/>
+        </w:rPr>
+        <w:t>def</w:t>
+      </w:r>
+      <w:proofErr w:type="spellEnd"/>
+      <w:r>
+        <w:rPr>
+          <w:lang w:val="uk-UA"/>
+        </w:rPr>
+        <w:t xml:space="preserve"> </w:t>
+      </w:r>
+      <w:proofErr w:type="spellStart"/>
+      <w:r>
+        <w:rPr>
+          <w:lang w:val="uk-UA"/>
+        </w:rPr>
+        <w:t>dilena</w:t>
+      </w:r>
+      <w:proofErr w:type="spellEnd"/>
+      <w:r>
+        <w:rPr>
+          <w:lang w:val="uk-UA"/>
+        </w:rPr>
+        <w:t>(a, b):</w:t>
+      </w:r>
+    </w:p>
+    <w:p>
+      <w:pPr>
+        <w:pBdr>
+          <w:top w:val="single" w:sz="4" w:space="1" w:color="auto"/>
+          <w:left w:val="single" w:sz="4" w:space="4" w:color="auto"/>
+          <w:bottom w:val="single" w:sz="4" w:space="1" w:color="auto"/>
+          <w:right w:val="single" w:sz="4" w:space="4" w:color="auto"/>
+        </w:pBdr>
+        <w:spacing w:after="0"/>
+        <w:rPr>
+          <w:lang w:val="uk-UA"/>
+        </w:rPr>
+      </w:pPr>
+      <w:r>
+        <w:rPr>
+          <w:lang w:val="uk-UA"/>
+        </w:rPr>
+        <w:t xml:space="preserve">    </w:t>
+      </w:r>
+      <w:proofErr w:type="spellStart"/>
+      <w:r>
+        <w:rPr>
+          <w:lang w:val="uk-UA"/>
+        </w:rPr>
+        <w:t>if</w:t>
+      </w:r>
+      <w:proofErr w:type="spellEnd"/>
+      <w:r>
+        <w:rPr>
+          <w:lang w:val="uk-UA"/>
+        </w:rPr>
+        <w:t xml:space="preserve"> b == 0:</w:t>
+      </w:r>
+    </w:p>
+    <w:p>
+      <w:pPr>
+        <w:pBdr>
+          <w:top w:val="single" w:sz="4" w:space="1" w:color="auto"/>
+          <w:left w:val="single" w:sz="4" w:space="4" w:color="auto"/>
+          <w:bottom w:val="single" w:sz="4" w:space="1" w:color="auto"/>
+          <w:right w:val="single" w:sz="4" w:space="4" w:color="auto"/>
+        </w:pBdr>
+        <w:spacing w:after="0"/>
+        <w:rPr>
+          <w:lang w:val="uk-UA"/>
+        </w:rPr>
+      </w:pPr>
+      <w:r>
+        <w:rPr>
+          <w:lang w:val="uk-UA"/>
+        </w:rPr>
+        <w:t xml:space="preserve">        </w:t>
+      </w:r>
+      <w:proofErr w:type="spellStart"/>
+      <w:r>
+        <w:rPr>
+          <w:lang w:val="uk-UA"/>
+        </w:rPr>
+        <w:t>return</w:t>
+      </w:r>
+      <w:proofErr w:type="spellEnd"/>
+      <w:r>
+        <w:rPr>
+          <w:lang w:val="uk-UA"/>
+        </w:rPr>
+        <w:t xml:space="preserve"> "Помилка: ділення на нуль"</w:t>
+      </w:r>
+    </w:p>
+    <w:p>
+      <w:pPr>
+        <w:pBdr>
+          <w:top w:val="single" w:sz="4" w:space="1" w:color="auto"/>
+          <w:left w:val="single" w:sz="4" w:space="4" w:color="auto"/>
+          <w:bottom w:val="single" w:sz="4" w:space="1" w:color="auto"/>
+          <w:right w:val="single" w:sz="4" w:space="4" w:color="auto"/>
+        </w:pBdr>
+        <w:spacing w:after="0"/>
+        <w:rPr>
+          <w:lang w:val="uk-UA"/>
+        </w:rPr>
+      </w:pPr>
+      <w:r>
+        <w:rPr>
+          <w:lang w:val="uk-UA"/>
+        </w:rPr>
+        <w:lastRenderedPageBreak/>
+        <w:t xml:space="preserve">    </w:t>
+      </w:r>
+      <w:proofErr w:type="spellStart"/>
+      <w:r>
+        <w:rPr>
+          <w:lang w:val="uk-UA"/>
+        </w:rPr>
+        <w:t>return</w:t>
+      </w:r>
+      <w:proofErr w:type="spellEnd"/>
+      <w:r>
+        <w:rPr>
+          <w:lang w:val="uk-UA"/>
+        </w:rPr>
+        <w:t xml:space="preserve"> a / b</w:t>
+      </w:r>
+    </w:p>
+    <w:p>
+      <w:pPr>
+        <w:spacing w:after="0"/>
+        <w:rPr>
+          <w:lang w:val="uk-UA"/>
+        </w:rPr>
+      </w:pPr>
+    </w:p>
+    <w:p>
+      <w:pPr>
+        <w:spacing w:after="0"/>
+        <w:rPr>
+          <w:b/>
+          <w:lang w:val="uk-UA"/>
+        </w:rPr>
+      </w:pPr>
+      <w:r>
+        <w:rPr>
+          <w:b/>
+          <w:lang w:val="uk-UA"/>
+        </w:rPr>
+        <w:t>operations.py</w:t>
+      </w:r>
+    </w:p>
+    <w:p>
+      <w:pPr>
+        <w:pBdr>
+          <w:top w:val="single" w:sz="4" w:space="1" w:color="auto"/>
+          <w:left w:val="single" w:sz="4" w:space="4" w:color="auto"/>
+          <w:bottom w:val="single" w:sz="4" w:space="1" w:color="auto"/>
+          <w:right w:val="single" w:sz="4" w:space="4" w:color="auto"/>
+        </w:pBdr>
+        <w:spacing w:after="0"/>
+        <w:rPr>
+          <w:rFonts w:cs="Times New Roman"/>
+          <w:szCs w:val="28"/>
+          <w:lang w:val="uk-UA"/>
+        </w:rPr>
+      </w:pPr>
+      <w:proofErr w:type="spellStart"/>
+      <w:r>
+        <w:rPr>
+          <w:rFonts w:cs="Times New Roman"/>
+          <w:szCs w:val="28"/>
+          <w:lang w:val="uk-UA"/>
+        </w:rPr>
+        <w:t>from</w:t>
+      </w:r>
+      <w:proofErr w:type="spellEnd"/>
+      <w:r>
+        <w:rPr>
+          <w:rFonts w:cs="Times New Roman"/>
+          <w:szCs w:val="28"/>
+          <w:lang w:val="uk-UA"/>
+        </w:rPr>
+        <w:t xml:space="preserve"> </w:t>
+      </w:r>
+      <w:proofErr w:type="spellStart"/>
+      <w:r>
+        <w:rPr>
+          <w:rFonts w:cs="Times New Roman"/>
+          <w:szCs w:val="28"/>
+          <w:lang w:val="uk-UA"/>
+        </w:rPr>
+        <w:t>functions</w:t>
+      </w:r>
+      <w:proofErr w:type="spellEnd"/>
+      <w:r>
+        <w:rPr>
+          <w:rFonts w:cs="Times New Roman"/>
+          <w:szCs w:val="28"/>
+          <w:lang w:val="uk-UA"/>
+        </w:rPr>
+        <w:t xml:space="preserve"> </w:t>
+      </w:r>
+      <w:proofErr w:type="spellStart"/>
+      <w:r>
+        <w:rPr>
+          <w:rFonts w:cs="Times New Roman"/>
+          <w:szCs w:val="28"/>
+          <w:lang w:val="uk-UA"/>
+        </w:rPr>
+        <w:t>import</w:t>
+      </w:r>
+      <w:proofErr w:type="spellEnd"/>
+      <w:r>
+        <w:rPr>
+          <w:rFonts w:cs="Times New Roman"/>
+          <w:szCs w:val="28"/>
+          <w:lang w:val="uk-UA"/>
+        </w:rPr>
+        <w:t xml:space="preserve"> </w:t>
+      </w:r>
+      <w:proofErr w:type="spellStart"/>
+      <w:r>
+        <w:rPr>
+          <w:rFonts w:cs="Times New Roman"/>
+          <w:szCs w:val="28"/>
+          <w:lang w:val="uk-UA"/>
+        </w:rPr>
+        <w:t>plus</w:t>
+      </w:r>
+      <w:proofErr w:type="spellEnd"/>
+      <w:r>
+        <w:rPr>
+          <w:rFonts w:cs="Times New Roman"/>
+          <w:szCs w:val="28"/>
+          <w:lang w:val="uk-UA"/>
+        </w:rPr>
+        <w:t xml:space="preserve">, </w:t>
+      </w:r>
+      <w:proofErr w:type="spellStart"/>
+      <w:r>
+        <w:rPr>
+          <w:rFonts w:cs="Times New Roman"/>
+          <w:szCs w:val="28"/>
+          <w:lang w:val="uk-UA"/>
+        </w:rPr>
+        <w:t>minus</w:t>
+      </w:r>
+      <w:proofErr w:type="spellEnd"/>
+      <w:r>
+        <w:rPr>
+          <w:rFonts w:cs="Times New Roman"/>
+          <w:szCs w:val="28"/>
+          <w:lang w:val="uk-UA"/>
+        </w:rPr>
+        <w:t xml:space="preserve">, </w:t>
+      </w:r>
+      <w:proofErr w:type="spellStart"/>
+      <w:r>
+        <w:rPr>
+          <w:rFonts w:cs="Times New Roman"/>
+          <w:szCs w:val="28"/>
+          <w:lang w:val="uk-UA"/>
+        </w:rPr>
+        <w:t>mnoj</w:t>
+      </w:r>
+      <w:proofErr w:type="spellEnd"/>
+      <w:r>
+        <w:rPr>
+          <w:rFonts w:cs="Times New Roman"/>
+          <w:szCs w:val="28"/>
+          <w:lang w:val="uk-UA"/>
+        </w:rPr>
+        <w:t xml:space="preserve">, </w:t>
+      </w:r>
+      <w:proofErr w:type="spellStart"/>
+      <w:r>
+        <w:rPr>
+          <w:rFonts w:cs="Times New Roman"/>
+          <w:szCs w:val="28"/>
+          <w:lang w:val="uk-UA"/>
+        </w:rPr>
+        <w:t>dilena</w:t>
+      </w:r>
+      <w:proofErr w:type="spellEnd"/>
+    </w:p>
+    <w:p>
+      <w:pPr>
+        <w:pBdr>
+          <w:top w:val="single" w:sz="4" w:space="1" w:color="auto"/>
+          <w:left w:val="single" w:sz="4" w:space="4" w:color="auto"/>
+          <w:bottom w:val="single" w:sz="4" w:space="1" w:color="auto"/>
+          <w:right w:val="single" w:sz="4" w:space="4" w:color="auto"/>
+        </w:pBdr>
+        <w:spacing w:after="0"/>
+        <w:rPr>
+          <w:rFonts w:cs="Times New Roman"/>
+          <w:szCs w:val="28"/>
+          <w:lang w:val="uk-UA"/>
+        </w:rPr>
+      </w:pPr>
+      <w:proofErr w:type="spellStart"/>
+      <w:r>
+        <w:rPr>
+          <w:rFonts w:cs="Times New Roman"/>
+          <w:szCs w:val="28"/>
+          <w:lang w:val="uk-UA"/>
+        </w:rPr>
+        <w:t>import</w:t>
+      </w:r>
+      <w:proofErr w:type="spellEnd"/>
+      <w:r>
+        <w:rPr>
+          <w:rFonts w:cs="Times New Roman"/>
+          <w:szCs w:val="28"/>
+          <w:lang w:val="uk-UA"/>
+        </w:rPr>
+        <w:t xml:space="preserve"> </w:t>
+      </w:r>
+      <w:proofErr w:type="spellStart"/>
+      <w:r>
+        <w:rPr>
+          <w:rFonts w:cs="Times New Roman"/>
+          <w:szCs w:val="28"/>
+          <w:lang w:val="uk-UA"/>
+        </w:rPr>
+        <w:t>logging</w:t>
+      </w:r>
+      <w:proofErr w:type="spellEnd"/>
+    </w:p>
+    <w:p>
+      <w:pPr>
+        <w:pBdr>
+          <w:top w:val="single" w:sz="4" w:space="1" w:color="auto"/>
+          <w:left w:val="single" w:sz="4" w:space="4" w:color="auto"/>
+          <w:bottom w:val="single" w:sz="4" w:space="1" w:color="auto"/>
+          <w:right w:val="single" w:sz="4" w:space="4" w:color="auto"/>
+        </w:pBdr>
+        <w:spacing w:after="0"/>
+        <w:rPr>
+          <w:rFonts w:cs="Times New Roman"/>
+          <w:szCs w:val="28"/>
+          <w:lang w:val="uk-UA"/>
+        </w:rPr>
+      </w:pPr>
+      <w:proofErr w:type="spellStart"/>
+      <w:r>
+        <w:rPr>
+          <w:rFonts w:cs="Times New Roman"/>
+          <w:szCs w:val="28"/>
+          <w:lang w:val="uk-UA"/>
+        </w:rPr>
+        <w:t>logging.basicConfig</w:t>
+      </w:r>
+      <w:proofErr w:type="spellEnd"/>
+      <w:r>
+        <w:rPr>
+          <w:rFonts w:cs="Times New Roman"/>
+          <w:szCs w:val="28"/>
+          <w:lang w:val="uk-UA"/>
+        </w:rPr>
+        <w:t>(</w:t>
+      </w:r>
+      <w:proofErr w:type="spellStart"/>
+      <w:r>
+        <w:rPr>
+          <w:rFonts w:cs="Times New Roman"/>
+          <w:szCs w:val="28"/>
+          <w:lang w:val="uk-UA"/>
+        </w:rPr>
+        <w:t>filename</w:t>
+      </w:r>
+      <w:proofErr w:type="spellEnd"/>
+      <w:r>
+        <w:rPr>
+          <w:rFonts w:cs="Times New Roman"/>
+          <w:szCs w:val="28"/>
+          <w:lang w:val="uk-UA"/>
+        </w:rPr>
+        <w:t xml:space="preserve">='calculator.log', </w:t>
+      </w:r>
+      <w:proofErr w:type="spellStart"/>
+      <w:r>
+        <w:rPr>
+          <w:rFonts w:cs="Times New Roman"/>
+          <w:szCs w:val="28"/>
+          <w:lang w:val="uk-UA"/>
+        </w:rPr>
+        <w:t>level</w:t>
+      </w:r>
+      <w:proofErr w:type="spellEnd"/>
+      <w:r>
+        <w:rPr>
+          <w:rFonts w:cs="Times New Roman"/>
+          <w:szCs w:val="28"/>
+          <w:lang w:val="uk-UA"/>
+        </w:rPr>
+        <w:t xml:space="preserve">=logging.INFO, </w:t>
+      </w:r>
+      <w:proofErr w:type="spellStart"/>
+      <w:r>
+        <w:rPr>
+          <w:rFonts w:cs="Times New Roman"/>
+          <w:szCs w:val="28"/>
+          <w:lang w:val="uk-UA"/>
+        </w:rPr>
+        <w:t>format</w:t>
+      </w:r>
+      <w:proofErr w:type="spellEnd"/>
+      <w:r>
+        <w:rPr>
+          <w:rFonts w:cs="Times New Roman"/>
+          <w:szCs w:val="28"/>
+          <w:lang w:val="uk-UA"/>
+        </w:rPr>
+        <w:t>='%(</w:t>
+      </w:r>
+      <w:proofErr w:type="spellStart"/>
+      <w:r>
+        <w:rPr>
+          <w:rFonts w:cs="Times New Roman"/>
+          <w:szCs w:val="28"/>
+          <w:lang w:val="uk-UA"/>
+        </w:rPr>
+        <w:t>asctime</w:t>
+      </w:r>
+      <w:proofErr w:type="spellEnd"/>
+      <w:r>
+        <w:rPr>
+          <w:rFonts w:cs="Times New Roman"/>
+          <w:szCs w:val="28"/>
+          <w:lang w:val="uk-UA"/>
+        </w:rPr>
+        <w:t>)s - %(</w:t>
+      </w:r>
+      <w:proofErr w:type="spellStart"/>
+      <w:r>
+        <w:rPr>
+          <w:rFonts w:cs="Times New Roman"/>
+          <w:szCs w:val="28"/>
+          <w:lang w:val="uk-UA"/>
+        </w:rPr>
+        <w:t>message</w:t>
+      </w:r>
+      <w:proofErr w:type="spellEnd"/>
+      <w:r>
+        <w:rPr>
+          <w:rFonts w:cs="Times New Roman"/>
+          <w:szCs w:val="28"/>
+          <w:lang w:val="uk-UA"/>
+        </w:rPr>
+        <w:t>)s')</w:t>
+      </w:r>
+    </w:p>
+    <w:p>
+      <w:pPr>
+        <w:pBdr>
+          <w:top w:val="single" w:sz="4" w:space="1" w:color="auto"/>
+          <w:left w:val="single" w:sz="4" w:space="4" w:color="auto"/>
+          <w:bottom w:val="single" w:sz="4" w:space="1" w:color="auto"/>
+          <w:right w:val="single" w:sz="4" w:space="4" w:color="auto"/>
+        </w:pBdr>
+        <w:spacing w:after="0"/>
+        <w:rPr>
+          <w:rFonts w:cs="Times New Roman"/>
+          <w:szCs w:val="28"/>
+          <w:lang w:val="uk-UA"/>
+        </w:rPr>
+      </w:pPr>
+      <w:proofErr w:type="spellStart"/>
+      <w:r>
+        <w:rPr>
+          <w:rFonts w:cs="Times New Roman"/>
+          <w:szCs w:val="28"/>
+          <w:lang w:val="uk-UA"/>
+        </w:rPr>
+        <w:t>def</w:t>
+      </w:r>
+      <w:proofErr w:type="spellEnd"/>
+      <w:r>
+        <w:rPr>
+          <w:rFonts w:cs="Times New Roman"/>
+          <w:szCs w:val="28"/>
+          <w:lang w:val="uk-UA"/>
+        </w:rPr>
+        <w:t xml:space="preserve"> </w:t>
+      </w:r>
+      <w:proofErr w:type="spellStart"/>
+      <w:r>
+        <w:rPr>
+          <w:rFonts w:cs="Times New Roman"/>
+          <w:szCs w:val="28"/>
+          <w:lang w:val="uk-UA"/>
+        </w:rPr>
+        <w:t>input_numbers</w:t>
+      </w:r>
+      <w:proofErr w:type="spellEnd"/>
+      <w:r>
+        <w:rPr>
+          <w:rFonts w:cs="Times New Roman"/>
+          <w:szCs w:val="28"/>
+          <w:lang w:val="uk-UA"/>
+        </w:rPr>
+        <w:t>():</w:t>
+      </w:r>
+    </w:p>
+    <w:p>
+      <w:pPr>
+        <w:pBdr>
+          <w:top w:val="single" w:sz="4" w:space="1" w:color="auto"/>
+          <w:left w:val="single" w:sz="4" w:space="4" w:color="auto"/>
+          <w:bottom w:val="single" w:sz="4" w:space="1" w:color="auto"/>
+          <w:right w:val="single" w:sz="4" w:space="4" w:color="auto"/>
+        </w:pBdr>
+        <w:spacing w:after="0"/>
+        <w:rPr>
+          <w:rFonts w:cs="Times New Roman"/>
+          <w:szCs w:val="28"/>
+          <w:lang w:val="uk-UA"/>
+        </w:rPr>
+      </w:pPr>
+      <w:r>
+        <w:rPr>
+          <w:rFonts w:cs="Times New Roman"/>
+          <w:szCs w:val="28"/>
+          <w:lang w:val="uk-UA"/>
+        </w:rPr>
+        <w:t xml:space="preserve">    a = </w:t>
+      </w:r>
+      <w:proofErr w:type="spellStart"/>
+      <w:r>
+        <w:rPr>
+          <w:rFonts w:cs="Times New Roman"/>
+          <w:szCs w:val="28"/>
+          <w:lang w:val="uk-UA"/>
+        </w:rPr>
+        <w:t>int</w:t>
+      </w:r>
+      <w:proofErr w:type="spellEnd"/>
+      <w:r>
+        <w:rPr>
+          <w:rFonts w:cs="Times New Roman"/>
+          <w:szCs w:val="28"/>
+          <w:lang w:val="uk-UA"/>
+        </w:rPr>
+        <w:t>(</w:t>
+      </w:r>
+      <w:proofErr w:type="spellStart"/>
+      <w:r>
+        <w:rPr>
+          <w:rFonts w:cs="Times New Roman"/>
+          <w:szCs w:val="28"/>
+          <w:lang w:val="uk-UA"/>
+        </w:rPr>
+        <w:t>input</w:t>
+      </w:r>
+      <w:proofErr w:type="spellEnd"/>
+      <w:r>
+        <w:rPr>
+          <w:rFonts w:cs="Times New Roman"/>
+          <w:szCs w:val="28"/>
+          <w:lang w:val="uk-UA"/>
+        </w:rPr>
+        <w:t>("Введіть перше число: "))</w:t>
+      </w:r>
+    </w:p>
+    <w:p>
+      <w:pPr>
+        <w:pBdr>
+          <w:top w:val="single" w:sz="4" w:space="1" w:color="auto"/>
+          <w:left w:val="single" w:sz="4" w:space="4" w:color="auto"/>
+          <w:bottom w:val="single" w:sz="4" w:space="1" w:color="auto"/>
+          <w:right w:val="single" w:sz="4" w:space="4" w:color="auto"/>
+        </w:pBdr>
+        <w:spacing w:after="0"/>
+        <w:rPr>
+          <w:rFonts w:cs="Times New Roman"/>
+          <w:szCs w:val="28"/>
+          <w:lang w:val="uk-UA"/>
+        </w:rPr>
+      </w:pPr>
+      <w:r>
+        <w:rPr>
+          <w:rFonts w:cs="Times New Roman"/>
+          <w:szCs w:val="28"/>
+          <w:lang w:val="uk-UA"/>
+        </w:rPr>
+        <w:t xml:space="preserve">    b = </w:t>
+      </w:r>
+      <w:proofErr w:type="spellStart"/>
+      <w:r>
+        <w:rPr>
+          <w:rFonts w:cs="Times New Roman"/>
+          <w:szCs w:val="28"/>
+          <w:lang w:val="uk-UA"/>
+        </w:rPr>
+        <w:t>int</w:t>
+      </w:r>
+      <w:proofErr w:type="spellEnd"/>
+      <w:r>
+        <w:rPr>
+          <w:rFonts w:cs="Times New Roman"/>
+          <w:szCs w:val="28"/>
+          <w:lang w:val="uk-UA"/>
+        </w:rPr>
+        <w:t>(</w:t>
+      </w:r>
+      <w:proofErr w:type="spellStart"/>
+      <w:r>
+        <w:rPr>
+          <w:rFonts w:cs="Times New Roman"/>
+          <w:szCs w:val="28"/>
+          <w:lang w:val="uk-UA"/>
+        </w:rPr>
+        <w:t>input</w:t>
+      </w:r>
+      <w:proofErr w:type="spellEnd"/>
+      <w:r>
+        <w:rPr>
+          <w:rFonts w:cs="Times New Roman"/>
+          <w:szCs w:val="28"/>
+          <w:lang w:val="uk-UA"/>
+        </w:rPr>
+        <w:t>("Введіть друге число: "))</w:t>
+      </w:r>
+    </w:p>
+    <w:p>
+      <w:pPr>
+        <w:pBdr>
+          <w:top w:val="single" w:sz="4" w:space="1" w:color="auto"/>
+          <w:left w:val="single" w:sz="4" w:space="4" w:color="auto"/>
+          <w:bottom w:val="single" w:sz="4" w:space="1" w:color="auto"/>
+          <w:right w:val="single" w:sz="4" w:space="4" w:color="auto"/>
+        </w:pBdr>
+        <w:spacing w:after="0"/>
+        <w:rPr>
+          <w:rFonts w:cs="Times New Roman"/>
+          <w:szCs w:val="28"/>
+          <w:lang w:val="uk-UA"/>
+        </w:rPr>
+      </w:pPr>
+      <w:r>
+        <w:rPr>
+          <w:rFonts w:cs="Times New Roman"/>
+          <w:szCs w:val="28"/>
+          <w:lang w:val="uk-UA"/>
+        </w:rPr>
+        <w:t xml:space="preserve">    </w:t>
+      </w:r>
+      <w:proofErr w:type="spellStart"/>
+      <w:r>
+        <w:rPr>
+          <w:rFonts w:cs="Times New Roman"/>
+          <w:szCs w:val="28"/>
+          <w:lang w:val="uk-UA"/>
+        </w:rPr>
+        <w:t>return</w:t>
+      </w:r>
+      <w:proofErr w:type="spellEnd"/>
+      <w:r>
+        <w:rPr>
+          <w:rFonts w:cs="Times New Roman"/>
+          <w:szCs w:val="28"/>
+          <w:lang w:val="uk-UA"/>
+        </w:rPr>
+        <w:t xml:space="preserve"> a, b</w:t>
+      </w:r>
+    </w:p>
+    <w:p>
+      <w:pPr>
+        <w:pBdr>
+          <w:top w:val="single" w:sz="4" w:space="1" w:color="auto"/>
+          <w:left w:val="single" w:sz="4" w:space="4" w:color="auto"/>
+          <w:bottom w:val="single" w:sz="4" w:space="1" w:color="auto"/>
+          <w:right w:val="single" w:sz="4" w:space="4" w:color="auto"/>
+        </w:pBdr>
+        <w:spacing w:after="0"/>
+        <w:rPr>
+          <w:rFonts w:cs="Times New Roman"/>
+          <w:szCs w:val="28"/>
+          <w:lang w:val="uk-UA"/>
+        </w:rPr>
+      </w:pPr>
+      <w:proofErr w:type="spellStart"/>
+      <w:r>
+        <w:rPr>
+          <w:rFonts w:cs="Times New Roman"/>
+          <w:szCs w:val="28"/>
+          <w:lang w:val="uk-UA"/>
+        </w:rPr>
+        <w:t>def</w:t>
+      </w:r>
+      <w:proofErr w:type="spellEnd"/>
+      <w:r>
+        <w:rPr>
+          <w:rFonts w:cs="Times New Roman"/>
+          <w:szCs w:val="28"/>
+          <w:lang w:val="uk-UA"/>
+        </w:rPr>
+        <w:t xml:space="preserve"> </w:t>
+      </w:r>
+      <w:proofErr w:type="spellStart"/>
+      <w:r>
+        <w:rPr>
+          <w:rFonts w:cs="Times New Roman"/>
+          <w:szCs w:val="28"/>
+          <w:lang w:val="uk-UA"/>
+        </w:rPr>
+        <w:t>input_operation</w:t>
+      </w:r>
+      <w:proofErr w:type="spellEnd"/>
+      <w:r>
+        <w:rPr>
+          <w:rFonts w:cs="Times New Roman"/>
+          <w:szCs w:val="28"/>
+          <w:lang w:val="uk-UA"/>
+        </w:rPr>
+        <w:t>():</w:t>
+      </w:r>
+    </w:p>
+    <w:p>
+      <w:pPr>
+        <w:pBdr>
+          <w:top w:val="single" w:sz="4" w:space="1" w:color="auto"/>
+          <w:left w:val="single" w:sz="4" w:space="4" w:color="auto"/>
+          <w:bottom w:val="single" w:sz="4" w:space="1" w:color="auto"/>
+          <w:right w:val="single" w:sz="4" w:space="4" w:color="auto"/>
+        </w:pBdr>
+        <w:spacing w:after="0"/>
+        <w:rPr>
+          <w:rFonts w:cs="Times New Roman"/>
+          <w:szCs w:val="28"/>
+          <w:lang w:val="uk-UA"/>
+        </w:rPr>
+      </w:pPr>
+      <w:r>
+        <w:rPr>
+          <w:rFonts w:cs="Times New Roman"/>
+          <w:szCs w:val="28"/>
+          <w:lang w:val="uk-UA"/>
+        </w:rPr>
+        <w:t xml:space="preserve">    </w:t>
+      </w:r>
+      <w:proofErr w:type="spellStart"/>
+      <w:r>
+        <w:rPr>
+          <w:rFonts w:cs="Times New Roman"/>
+          <w:szCs w:val="28"/>
+          <w:lang w:val="uk-UA"/>
+        </w:rPr>
+        <w:t>return</w:t>
+      </w:r>
+      <w:proofErr w:type="spellEnd"/>
+      <w:r>
+        <w:rPr>
+          <w:rFonts w:cs="Times New Roman"/>
+          <w:szCs w:val="28"/>
+          <w:lang w:val="uk-UA"/>
+        </w:rPr>
+        <w:t xml:space="preserve"> </w:t>
+      </w:r>
+      <w:proofErr w:type="spellStart"/>
+      <w:r>
+        <w:rPr>
+          <w:rFonts w:cs="Times New Roman"/>
+          <w:szCs w:val="28"/>
+          <w:lang w:val="uk-UA"/>
+        </w:rPr>
+        <w:t>input</w:t>
+      </w:r>
+      <w:proofErr w:type="spellEnd"/>
+      <w:r>
+        <w:rPr>
+          <w:rFonts w:cs="Times New Roman"/>
+          <w:szCs w:val="28"/>
+          <w:lang w:val="uk-UA"/>
+        </w:rPr>
+        <w:t>("Виберіть операцію (+-*/): ")</w:t>
+      </w:r>
+    </w:p>
+    <w:p>
+      <w:pPr>
+        <w:pBdr>
+          <w:top w:val="single" w:sz="4" w:space="1" w:color="auto"/>
+          <w:left w:val="single" w:sz="4" w:space="4" w:color="auto"/>
+          <w:bottom w:val="single" w:sz="4" w:space="1" w:color="auto"/>
+          <w:right w:val="single" w:sz="4" w:space="4" w:color="auto"/>
+        </w:pBdr>
+        <w:spacing w:after="0"/>
+        <w:rPr>
+          <w:rFonts w:cs="Times New Roman"/>
+          <w:szCs w:val="28"/>
+          <w:lang w:val="uk-UA"/>
+        </w:rPr>
+      </w:pPr>
+      <w:proofErr w:type="spellStart"/>
+      <w:r>
+        <w:rPr>
+          <w:rFonts w:cs="Times New Roman"/>
+          <w:szCs w:val="28"/>
+          <w:lang w:val="uk-UA"/>
+        </w:rPr>
+        <w:t>def</w:t>
+      </w:r>
+      <w:proofErr w:type="spellEnd"/>
+      <w:r>
+        <w:rPr>
+          <w:rFonts w:cs="Times New Roman"/>
+          <w:szCs w:val="28"/>
+          <w:lang w:val="uk-UA"/>
+        </w:rPr>
+        <w:t xml:space="preserve"> </w:t>
+      </w:r>
+      <w:proofErr w:type="spellStart"/>
+      <w:r>
+        <w:rPr>
+          <w:rFonts w:cs="Times New Roman"/>
+          <w:szCs w:val="28"/>
+          <w:lang w:val="uk-UA"/>
+        </w:rPr>
+        <w:t>do_operation</w:t>
+      </w:r>
+      <w:proofErr w:type="spellEnd"/>
+      <w:r>
+        <w:rPr>
+          <w:rFonts w:cs="Times New Roman"/>
+          <w:szCs w:val="28"/>
+          <w:lang w:val="uk-UA"/>
+        </w:rPr>
+        <w:t>(a, b, f):</w:t>
+      </w:r>
+    </w:p>
+    <w:p>
+      <w:pPr>
+        <w:pBdr>
+          <w:top w:val="single" w:sz="4" w:space="1" w:color="auto"/>
+          <w:left w:val="single" w:sz="4" w:space="4" w:color="auto"/>
+          <w:bottom w:val="single" w:sz="4" w:space="1" w:color="auto"/>
+          <w:right w:val="single" w:sz="4" w:space="4" w:color="auto"/>
+        </w:pBdr>
+        <w:spacing w:after="0"/>
+        <w:rPr>
+          <w:rFonts w:cs="Times New Roman"/>
+          <w:szCs w:val="28"/>
+          <w:lang w:val="uk-UA"/>
+        </w:rPr>
+      </w:pPr>
+      <w:r>
+        <w:rPr>
+          <w:rFonts w:cs="Times New Roman"/>
+          <w:szCs w:val="28"/>
+          <w:lang w:val="uk-UA"/>
+        </w:rPr>
+        <w:t xml:space="preserve">    </w:t>
+      </w:r>
+      <w:proofErr w:type="spellStart"/>
+      <w:r>
+        <w:rPr>
+          <w:rFonts w:cs="Times New Roman"/>
+          <w:szCs w:val="28"/>
+          <w:lang w:val="uk-UA"/>
+        </w:rPr>
+        <w:t>if</w:t>
+      </w:r>
+      <w:proofErr w:type="spellEnd"/>
+      <w:r>
+        <w:rPr>
+          <w:rFonts w:cs="Times New Roman"/>
+          <w:szCs w:val="28"/>
+          <w:lang w:val="uk-UA"/>
+        </w:rPr>
+        <w:t xml:space="preserve"> f == '+':</w:t>
+      </w:r>
+    </w:p>
+    <w:p>
+      <w:pPr>
+        <w:pBdr>
+          <w:top w:val="single" w:sz="4" w:space="1" w:color="auto"/>
+          <w:left w:val="single" w:sz="4" w:space="4" w:color="auto"/>
+          <w:bottom w:val="single" w:sz="4" w:space="1" w:color="auto"/>
+          <w:right w:val="single" w:sz="4" w:space="4" w:color="auto"/>
+        </w:pBdr>
+        <w:spacing w:after="0"/>
+        <w:rPr>
+          <w:rFonts w:cs="Times New Roman"/>
+          <w:szCs w:val="28"/>
+          <w:lang w:val="uk-UA"/>
+        </w:rPr>
+      </w:pPr>
+      <w:r>
+        <w:rPr>
+          <w:rFonts w:cs="Times New Roman"/>
+          <w:szCs w:val="28"/>
+          <w:lang w:val="uk-UA"/>
+        </w:rPr>
+        <w:t xml:space="preserve">        </w:t>
+      </w:r>
+      <w:proofErr w:type="spellStart"/>
+      <w:r>
+        <w:rPr>
+          <w:rFonts w:cs="Times New Roman"/>
+          <w:szCs w:val="28"/>
+          <w:lang w:val="uk-UA"/>
+        </w:rPr>
+        <w:t>result</w:t>
+      </w:r>
+      <w:proofErr w:type="spellEnd"/>
+      <w:r>
+        <w:rPr>
+          <w:rFonts w:cs="Times New Roman"/>
+          <w:szCs w:val="28"/>
+          <w:lang w:val="uk-UA"/>
+        </w:rPr>
+        <w:t xml:space="preserve"> = </w:t>
+      </w:r>
+      <w:proofErr w:type="spellStart"/>
+      <w:r>
+        <w:rPr>
+          <w:rFonts w:cs="Times New Roman"/>
+          <w:szCs w:val="28"/>
+          <w:lang w:val="uk-UA"/>
+        </w:rPr>
+        <w:t>plus</w:t>
+      </w:r>
+      <w:proofErr w:type="spellEnd"/>
+      <w:r>
+        <w:rPr>
+          <w:rFonts w:cs="Times New Roman"/>
+          <w:szCs w:val="28"/>
+          <w:lang w:val="uk-UA"/>
+        </w:rPr>
+        <w:t>(a, b)</w:t>
+      </w:r>
+    </w:p>
+    <w:p>
+      <w:pPr>
+        <w:pBdr>
+          <w:top w:val="single" w:sz="4" w:space="1" w:color="auto"/>
+          <w:left w:val="single" w:sz="4" w:space="4" w:color="auto"/>
+          <w:bottom w:val="single" w:sz="4" w:space="1" w:color="auto"/>
+          <w:right w:val="single" w:sz="4" w:space="4" w:color="auto"/>
+        </w:pBdr>
+        <w:spacing w:after="0"/>
+        <w:rPr>
+          <w:rFonts w:cs="Times New Roman"/>
+          <w:szCs w:val="28"/>
+          <w:lang w:val="uk-UA"/>
+        </w:rPr>
+      </w:pPr>
+      <w:r>
+        <w:rPr>
+          <w:rFonts w:cs="Times New Roman"/>
+          <w:szCs w:val="28"/>
+          <w:lang w:val="uk-UA"/>
+        </w:rPr>
+        <w:t xml:space="preserve">        </w:t>
+      </w:r>
+      <w:proofErr w:type="spellStart"/>
+      <w:r>
+        <w:rPr>
+          <w:rFonts w:cs="Times New Roman"/>
+          <w:szCs w:val="28"/>
+          <w:lang w:val="uk-UA"/>
+        </w:rPr>
+        <w:t>log_operation</w:t>
+      </w:r>
+      <w:proofErr w:type="spellEnd"/>
+      <w:r>
+        <w:rPr>
+          <w:rFonts w:cs="Times New Roman"/>
+          <w:szCs w:val="28"/>
+          <w:lang w:val="uk-UA"/>
+        </w:rPr>
+        <w:t xml:space="preserve">(a, b, '+', </w:t>
+      </w:r>
+      <w:proofErr w:type="spellStart"/>
+      <w:r>
+        <w:rPr>
+          <w:rFonts w:cs="Times New Roman"/>
+          <w:szCs w:val="28"/>
+          <w:lang w:val="uk-UA"/>
+        </w:rPr>
+        <w:t>result</w:t>
+      </w:r>
+      <w:proofErr w:type="spellEnd"/>
+      <w:r>
+        <w:rPr>
+          <w:rFonts w:cs="Times New Roman"/>
+          <w:szCs w:val="28"/>
+          <w:lang w:val="uk-UA"/>
+        </w:rPr>
+        <w:t>)</w:t>
+      </w:r>
+    </w:p>
+    <w:p>
+      <w:pPr>
+        <w:pBdr>
+          <w:top w:val="single" w:sz="4" w:space="1" w:color="auto"/>
+          <w:left w:val="single" w:sz="4" w:space="4" w:color="auto"/>
+          <w:bottom w:val="single" w:sz="4" w:space="1" w:color="auto"/>
+          <w:right w:val="single" w:sz="4" w:space="4" w:color="auto"/>
+        </w:pBdr>
+        <w:spacing w:after="0"/>
+        <w:rPr>
+          <w:rFonts w:cs="Times New Roman"/>
+          <w:szCs w:val="28"/>
+          <w:lang w:val="uk-UA"/>
+        </w:rPr>
+      </w:pPr>
+      <w:r>
+        <w:rPr>
+          <w:rFonts w:cs="Times New Roman"/>
+          <w:szCs w:val="28"/>
+          <w:lang w:val="uk-UA"/>
+        </w:rPr>
+        <w:t xml:space="preserve">        </w:t>
+      </w:r>
+      <w:proofErr w:type="spellStart"/>
+      <w:r>
+        <w:rPr>
+          <w:rFonts w:cs="Times New Roman"/>
+          <w:szCs w:val="28"/>
+          <w:lang w:val="uk-UA"/>
+        </w:rPr>
+        <w:t>return</w:t>
+      </w:r>
+      <w:proofErr w:type="spellEnd"/>
+      <w:r>
+        <w:rPr>
+          <w:rFonts w:cs="Times New Roman"/>
+          <w:szCs w:val="28"/>
+          <w:lang w:val="uk-UA"/>
+        </w:rPr>
+        <w:t xml:space="preserve"> </w:t>
+      </w:r>
+      <w:proofErr w:type="spellStart"/>
+      <w:r>
+        <w:rPr>
+          <w:rFonts w:cs="Times New Roman"/>
+          <w:szCs w:val="28"/>
+          <w:lang w:val="uk-UA"/>
+        </w:rPr>
+        <w:t>result</w:t>
+      </w:r>
+      <w:proofErr w:type="spellEnd"/>
+    </w:p>
+    <w:p>
+      <w:pPr>
+        <w:pBdr>
+          <w:top w:val="single" w:sz="4" w:space="1" w:color="auto"/>
+          <w:left w:val="single" w:sz="4" w:space="4" w:color="auto"/>
+          <w:bottom w:val="single" w:sz="4" w:space="1" w:color="auto"/>
+          <w:right w:val="single" w:sz="4" w:space="4" w:color="auto"/>
+        </w:pBdr>
+        <w:spacing w:after="0"/>
+        <w:rPr>
+          <w:rFonts w:cs="Times New Roman"/>
+          <w:szCs w:val="28"/>
+          <w:lang w:val="uk-UA"/>
+        </w:rPr>
+      </w:pPr>
+      <w:r>
+        <w:rPr>
+          <w:rFonts w:cs="Times New Roman"/>
+          <w:szCs w:val="28"/>
+          <w:lang w:val="uk-UA"/>
+        </w:rPr>
+        <w:t xml:space="preserve">    </w:t>
+      </w:r>
+      <w:proofErr w:type="spellStart"/>
+      <w:r>
+        <w:rPr>
+          <w:rFonts w:cs="Times New Roman"/>
+          <w:szCs w:val="28"/>
+          <w:lang w:val="uk-UA"/>
+        </w:rPr>
+        <w:t>elif</w:t>
+      </w:r>
+      <w:proofErr w:type="spellEnd"/>
+      <w:r>
+        <w:rPr>
+          <w:rFonts w:cs="Times New Roman"/>
+          <w:szCs w:val="28"/>
+          <w:lang w:val="uk-UA"/>
+        </w:rPr>
+        <w:t xml:space="preserve"> f == '-':</w:t>
+      </w:r>
+    </w:p>
+    <w:p>
+      <w:pPr>
+        <w:pBdr>
+          <w:top w:val="single" w:sz="4" w:space="1" w:color="auto"/>
+          <w:left w:val="single" w:sz="4" w:space="4" w:color="auto"/>
+          <w:bottom w:val="single" w:sz="4" w:space="1" w:color="auto"/>
+          <w:right w:val="single" w:sz="4" w:space="4" w:color="auto"/>
+        </w:pBdr>
+        <w:spacing w:after="0"/>
+        <w:rPr>
+          <w:rFonts w:cs="Times New Roman"/>
+          <w:szCs w:val="28"/>
+          <w:lang w:val="uk-UA"/>
+        </w:rPr>
+      </w:pPr>
+      <w:r>
+        <w:rPr>
+          <w:rFonts w:cs="Times New Roman"/>
+          <w:szCs w:val="28"/>
+          <w:lang w:val="uk-UA"/>
+        </w:rPr>
+        <w:t xml:space="preserve">        </w:t>
+      </w:r>
+      <w:proofErr w:type="spellStart"/>
+      <w:r>
+        <w:rPr>
+          <w:rFonts w:cs="Times New Roman"/>
+          <w:szCs w:val="28"/>
+          <w:lang w:val="uk-UA"/>
+        </w:rPr>
+        <w:t>result</w:t>
+      </w:r>
+      <w:proofErr w:type="spellEnd"/>
+      <w:r>
+        <w:rPr>
+          <w:rFonts w:cs="Times New Roman"/>
+          <w:szCs w:val="28"/>
+          <w:lang w:val="uk-UA"/>
+        </w:rPr>
+        <w:t xml:space="preserve"> = </w:t>
+      </w:r>
+      <w:proofErr w:type="spellStart"/>
+      <w:r>
+        <w:rPr>
+          <w:rFonts w:cs="Times New Roman"/>
+          <w:szCs w:val="28"/>
+          <w:lang w:val="uk-UA"/>
+        </w:rPr>
+        <w:t>minus</w:t>
+      </w:r>
+      <w:proofErr w:type="spellEnd"/>
+      <w:r>
+        <w:rPr>
+          <w:rFonts w:cs="Times New Roman"/>
+          <w:szCs w:val="28"/>
+          <w:lang w:val="uk-UA"/>
+        </w:rPr>
+        <w:t>(a, b)</w:t>
+      </w:r>
+    </w:p>
+    <w:p>
+      <w:pPr>
+        <w:pBdr>
+          <w:top w:val="single" w:sz="4" w:space="1" w:color="auto"/>
+          <w:left w:val="single" w:sz="4" w:space="4" w:color="auto"/>
+          <w:bottom w:val="single" w:sz="4" w:space="1" w:color="auto"/>
+          <w:right w:val="single" w:sz="4" w:space="4" w:color="auto"/>
+        </w:pBdr>
+        <w:spacing w:after="0"/>
+        <w:rPr>
+          <w:rFonts w:cs="Times New Roman"/>
+          <w:szCs w:val="28"/>
+          <w:lang w:val="uk-UA"/>
+        </w:rPr>
+      </w:pPr>
+      <w:r>
+        <w:rPr>
+          <w:rFonts w:cs="Times New Roman"/>
+          <w:szCs w:val="28"/>
+          <w:lang w:val="uk-UA"/>
+        </w:rPr>
+        <w:t xml:space="preserve">        </w:t>
+      </w:r>
+      <w:proofErr w:type="spellStart"/>
+      <w:r>
+        <w:rPr>
+          <w:rFonts w:cs="Times New Roman"/>
+          <w:szCs w:val="28"/>
+          <w:lang w:val="uk-UA"/>
+        </w:rPr>
+        <w:t>log_operation</w:t>
+      </w:r>
+      <w:proofErr w:type="spellEnd"/>
+      <w:r>
+        <w:rPr>
+          <w:rFonts w:cs="Times New Roman"/>
+          <w:szCs w:val="28"/>
+          <w:lang w:val="uk-UA"/>
+        </w:rPr>
+        <w:t xml:space="preserve">(a, b, '-', </w:t>
+      </w:r>
+      <w:proofErr w:type="spellStart"/>
+      <w:r>
+        <w:rPr>
+          <w:rFonts w:cs="Times New Roman"/>
+          <w:szCs w:val="28"/>
+          <w:lang w:val="uk-UA"/>
+        </w:rPr>
+        <w:t>result</w:t>
+      </w:r>
+      <w:proofErr w:type="spellEnd"/>
+      <w:r>
+        <w:rPr>
+          <w:rFonts w:cs="Times New Roman"/>
+          <w:szCs w:val="28"/>
+          <w:lang w:val="uk-UA"/>
+        </w:rPr>
+        <w:t xml:space="preserve">)  </w:t>
+      </w:r>
+    </w:p>
+    <w:p>
+      <w:pPr>
+        <w:pBdr>
+          <w:top w:val="single" w:sz="4" w:space="1" w:color="auto"/>
+          <w:left w:val="single" w:sz="4" w:space="4" w:color="auto"/>
+          <w:bottom w:val="single" w:sz="4" w:space="1" w:color="auto"/>
+          <w:right w:val="single" w:sz="4" w:space="4" w:color="auto"/>
+        </w:pBdr>
+        <w:spacing w:after="0"/>
+        <w:rPr>
+          <w:rFonts w:cs="Times New Roman"/>
+          <w:szCs w:val="28"/>
+          <w:lang w:val="uk-UA"/>
+        </w:rPr>
+      </w:pPr>
+      <w:r>
+        <w:rPr>
+          <w:rFonts w:cs="Times New Roman"/>
+          <w:szCs w:val="28"/>
+          <w:lang w:val="uk-UA"/>
+        </w:rPr>
+        <w:t xml:space="preserve">        </w:t>
+      </w:r>
+      <w:proofErr w:type="spellStart"/>
+      <w:r>
+        <w:rPr>
+          <w:rFonts w:cs="Times New Roman"/>
+          <w:szCs w:val="28"/>
+          <w:lang w:val="uk-UA"/>
+        </w:rPr>
+        <w:t>return</w:t>
+      </w:r>
+      <w:proofErr w:type="spellEnd"/>
+      <w:r>
+        <w:rPr>
+          <w:rFonts w:cs="Times New Roman"/>
+          <w:szCs w:val="28"/>
+          <w:lang w:val="uk-UA"/>
+        </w:rPr>
+        <w:t xml:space="preserve"> </w:t>
+      </w:r>
+      <w:proofErr w:type="spellStart"/>
+      <w:r>
+        <w:rPr>
+          <w:rFonts w:cs="Times New Roman"/>
+          <w:szCs w:val="28"/>
+          <w:lang w:val="uk-UA"/>
+        </w:rPr>
+        <w:t>result</w:t>
+      </w:r>
+      <w:proofErr w:type="spellEnd"/>
+    </w:p>
+    <w:p>
+      <w:pPr>
+        <w:pBdr>
+          <w:top w:val="single" w:sz="4" w:space="1" w:color="auto"/>
+          <w:left w:val="single" w:sz="4" w:space="4" w:color="auto"/>
+          <w:bottom w:val="single" w:sz="4" w:space="1" w:color="auto"/>
+          <w:right w:val="single" w:sz="4" w:space="4" w:color="auto"/>
+        </w:pBdr>
+        <w:spacing w:after="0"/>
+        <w:rPr>
+          <w:rFonts w:cs="Times New Roman"/>
+          <w:szCs w:val="28"/>
+          <w:lang w:val="uk-UA"/>
+        </w:rPr>
+      </w:pPr>
+      <w:r>
+        <w:rPr>
+          <w:rFonts w:cs="Times New Roman"/>
+          <w:szCs w:val="28"/>
+          <w:lang w:val="uk-UA"/>
+        </w:rPr>
+        <w:t xml:space="preserve">    </w:t>
+      </w:r>
+      <w:proofErr w:type="spellStart"/>
+      <w:r>
+        <w:rPr>
+          <w:rFonts w:cs="Times New Roman"/>
+          <w:szCs w:val="28"/>
+          <w:lang w:val="uk-UA"/>
+        </w:rPr>
+        <w:t>elif</w:t>
+      </w:r>
+      <w:proofErr w:type="spellEnd"/>
+      <w:r>
+        <w:rPr>
+          <w:rFonts w:cs="Times New Roman"/>
+          <w:szCs w:val="28"/>
+          <w:lang w:val="uk-UA"/>
+        </w:rPr>
+        <w:t xml:space="preserve"> f == '*':</w:t>
+      </w:r>
+    </w:p>
+    <w:p>
+      <w:pPr>
+        <w:pBdr>
+          <w:top w:val="single" w:sz="4" w:space="1" w:color="auto"/>
+          <w:left w:val="single" w:sz="4" w:space="4" w:color="auto"/>
+          <w:bottom w:val="single" w:sz="4" w:space="1" w:color="auto"/>
+          <w:right w:val="single" w:sz="4" w:space="4" w:color="auto"/>
+        </w:pBdr>
+        <w:spacing w:after="0"/>
+        <w:rPr>
+          <w:rFonts w:cs="Times New Roman"/>
+          <w:szCs w:val="28"/>
+          <w:lang w:val="uk-UA"/>
+        </w:rPr>
+      </w:pPr>
+      <w:r>
+        <w:rPr>
+          <w:rFonts w:cs="Times New Roman"/>
+          <w:szCs w:val="28"/>
+          <w:lang w:val="uk-UA"/>
+        </w:rPr>
+        <w:t xml:space="preserve">        </w:t>
+      </w:r>
+      <w:proofErr w:type="spellStart"/>
+      <w:r>
+        <w:rPr>
+          <w:rFonts w:cs="Times New Roman"/>
+          <w:szCs w:val="28"/>
+          <w:lang w:val="uk-UA"/>
+        </w:rPr>
+        <w:t>result</w:t>
+      </w:r>
+      <w:proofErr w:type="spellEnd"/>
+      <w:r>
+        <w:rPr>
+          <w:rFonts w:cs="Times New Roman"/>
+          <w:szCs w:val="28"/>
+          <w:lang w:val="uk-UA"/>
+        </w:rPr>
+        <w:t xml:space="preserve"> = </w:t>
+      </w:r>
+      <w:proofErr w:type="spellStart"/>
+      <w:r>
+        <w:rPr>
+          <w:rFonts w:cs="Times New Roman"/>
+          <w:szCs w:val="28"/>
+          <w:lang w:val="uk-UA"/>
+        </w:rPr>
+        <w:t>mnoj</w:t>
+      </w:r>
+      <w:proofErr w:type="spellEnd"/>
+      <w:r>
+        <w:rPr>
+          <w:rFonts w:cs="Times New Roman"/>
+          <w:szCs w:val="28"/>
+          <w:lang w:val="uk-UA"/>
+        </w:rPr>
+        <w:t>(a, b)</w:t>
+      </w:r>
+    </w:p>
+    <w:p>
+      <w:pPr>
+        <w:pBdr>
+          <w:top w:val="single" w:sz="4" w:space="1" w:color="auto"/>
+          <w:left w:val="single" w:sz="4" w:space="4" w:color="auto"/>
+          <w:bottom w:val="single" w:sz="4" w:space="1" w:color="auto"/>
+          <w:right w:val="single" w:sz="4" w:space="4" w:color="auto"/>
+        </w:pBdr>
+        <w:spacing w:after="0"/>
+        <w:rPr>
+          <w:rFonts w:cs="Times New Roman"/>
+          <w:szCs w:val="28"/>
+          <w:lang w:val="uk-UA"/>
+        </w:rPr>
+      </w:pPr>
+      <w:r>
+        <w:rPr>
+          <w:rFonts w:cs="Times New Roman"/>
+          <w:szCs w:val="28"/>
+          <w:lang w:val="uk-UA"/>
+        </w:rPr>
+        <w:t xml:space="preserve">        </w:t>
+      </w:r>
+      <w:proofErr w:type="spellStart"/>
+      <w:r>
+        <w:rPr>
+          <w:rFonts w:cs="Times New Roman"/>
+          <w:szCs w:val="28"/>
+          <w:lang w:val="uk-UA"/>
+        </w:rPr>
+        <w:t>log_operation</w:t>
+      </w:r>
+      <w:proofErr w:type="spellEnd"/>
+      <w:r>
+        <w:rPr>
+          <w:rFonts w:cs="Times New Roman"/>
+          <w:szCs w:val="28"/>
+          <w:lang w:val="uk-UA"/>
+        </w:rPr>
+        <w:t xml:space="preserve">(a, b, '*', </w:t>
+      </w:r>
+      <w:proofErr w:type="spellStart"/>
+      <w:r>
+        <w:rPr>
+          <w:rFonts w:cs="Times New Roman"/>
+          <w:szCs w:val="28"/>
+          <w:lang w:val="uk-UA"/>
+        </w:rPr>
+        <w:t>result</w:t>
+      </w:r>
+      <w:proofErr w:type="spellEnd"/>
+      <w:r>
+        <w:rPr>
+          <w:rFonts w:cs="Times New Roman"/>
+          <w:szCs w:val="28"/>
+          <w:lang w:val="uk-UA"/>
+        </w:rPr>
+        <w:t xml:space="preserve">)  </w:t>
+      </w:r>
+    </w:p>
+    <w:p>
+      <w:pPr>
+        <w:pBdr>
+          <w:top w:val="single" w:sz="4" w:space="1" w:color="auto"/>
+          <w:left w:val="single" w:sz="4" w:space="4" w:color="auto"/>
+          <w:bottom w:val="single" w:sz="4" w:space="1" w:color="auto"/>
+          <w:right w:val="single" w:sz="4" w:space="4" w:color="auto"/>
+        </w:pBdr>
+        <w:spacing w:after="0"/>
+        <w:rPr>
+          <w:rFonts w:cs="Times New Roman"/>
+          <w:szCs w:val="28"/>
+          <w:lang w:val="uk-UA"/>
+        </w:rPr>
+      </w:pPr>
+      <w:r>
+        <w:rPr>
+          <w:rFonts w:cs="Times New Roman"/>
+          <w:szCs w:val="28"/>
+          <w:lang w:val="uk-UA"/>
+        </w:rPr>
+        <w:t xml:space="preserve">        </w:t>
+      </w:r>
+      <w:proofErr w:type="spellStart"/>
+      <w:r>
+        <w:rPr>
+          <w:rFonts w:cs="Times New Roman"/>
+          <w:szCs w:val="28"/>
+          <w:lang w:val="uk-UA"/>
+        </w:rPr>
+        <w:t>return</w:t>
+      </w:r>
+      <w:proofErr w:type="spellEnd"/>
+      <w:r>
+        <w:rPr>
+          <w:rFonts w:cs="Times New Roman"/>
+          <w:szCs w:val="28"/>
+          <w:lang w:val="uk-UA"/>
+        </w:rPr>
+        <w:t xml:space="preserve"> </w:t>
+      </w:r>
+      <w:proofErr w:type="spellStart"/>
+      <w:r>
+        <w:rPr>
+          <w:rFonts w:cs="Times New Roman"/>
+          <w:szCs w:val="28"/>
+          <w:lang w:val="uk-UA"/>
+        </w:rPr>
+        <w:t>result</w:t>
+      </w:r>
+      <w:proofErr w:type="spellEnd"/>
+    </w:p>
+    <w:p>
+      <w:pPr>
+        <w:pBdr>
+          <w:top w:val="single" w:sz="4" w:space="1" w:color="auto"/>
+          <w:left w:val="single" w:sz="4" w:space="4" w:color="auto"/>
+          <w:bottom w:val="single" w:sz="4" w:space="1" w:color="auto"/>
+          <w:right w:val="single" w:sz="4" w:space="4" w:color="auto"/>
+        </w:pBdr>
+        <w:spacing w:after="0"/>
+        <w:rPr>
+          <w:rFonts w:cs="Times New Roman"/>
+          <w:szCs w:val="28"/>
+          <w:lang w:val="uk-UA"/>
+        </w:rPr>
+      </w:pPr>
+      <w:r>
+        <w:rPr>
+          <w:rFonts w:cs="Times New Roman"/>
+          <w:szCs w:val="28"/>
+          <w:lang w:val="uk-UA"/>
+        </w:rPr>
+        <w:lastRenderedPageBreak/>
+        <w:t xml:space="preserve">    </w:t>
+      </w:r>
+      <w:proofErr w:type="spellStart"/>
+      <w:r>
+        <w:rPr>
+          <w:rFonts w:cs="Times New Roman"/>
+          <w:szCs w:val="28"/>
+          <w:lang w:val="uk-UA"/>
+        </w:rPr>
+        <w:t>elif</w:t>
+      </w:r>
+      <w:proofErr w:type="spellEnd"/>
+      <w:r>
+        <w:rPr>
+          <w:rFonts w:cs="Times New Roman"/>
+          <w:szCs w:val="28"/>
+          <w:lang w:val="uk-UA"/>
+        </w:rPr>
+        <w:t xml:space="preserve"> f == '/':</w:t>
+      </w:r>
+    </w:p>
+    <w:p>
+      <w:pPr>
+        <w:pBdr>
+          <w:top w:val="single" w:sz="4" w:space="1" w:color="auto"/>
+          <w:left w:val="single" w:sz="4" w:space="4" w:color="auto"/>
+          <w:bottom w:val="single" w:sz="4" w:space="1" w:color="auto"/>
+          <w:right w:val="single" w:sz="4" w:space="4" w:color="auto"/>
+        </w:pBdr>
+        <w:spacing w:after="0"/>
+        <w:rPr>
+          <w:rFonts w:cs="Times New Roman"/>
+          <w:szCs w:val="28"/>
+          <w:lang w:val="uk-UA"/>
+        </w:rPr>
+      </w:pPr>
+      <w:r>
+        <w:rPr>
+          <w:rFonts w:cs="Times New Roman"/>
+          <w:szCs w:val="28"/>
+          <w:lang w:val="uk-UA"/>
+        </w:rPr>
+        <w:t xml:space="preserve">        </w:t>
+      </w:r>
+      <w:proofErr w:type="spellStart"/>
+      <w:r>
+        <w:rPr>
+          <w:rFonts w:cs="Times New Roman"/>
+          <w:szCs w:val="28"/>
+          <w:lang w:val="uk-UA"/>
+        </w:rPr>
+        <w:t>result</w:t>
+      </w:r>
+      <w:proofErr w:type="spellEnd"/>
+      <w:r>
+        <w:rPr>
+          <w:rFonts w:cs="Times New Roman"/>
+          <w:szCs w:val="28"/>
+          <w:lang w:val="uk-UA"/>
+        </w:rPr>
+        <w:t xml:space="preserve"> = </w:t>
+      </w:r>
+      <w:proofErr w:type="spellStart"/>
+      <w:r>
+        <w:rPr>
+          <w:rFonts w:cs="Times New Roman"/>
+          <w:szCs w:val="28"/>
+          <w:lang w:val="uk-UA"/>
+        </w:rPr>
+        <w:t>dilena</w:t>
+      </w:r>
+      <w:proofErr w:type="spellEnd"/>
+      <w:r>
+        <w:rPr>
+          <w:rFonts w:cs="Times New Roman"/>
+          <w:szCs w:val="28"/>
+          <w:lang w:val="uk-UA"/>
+        </w:rPr>
+        <w:t>(a, b)</w:t>
+      </w:r>
+    </w:p>
+    <w:p>
+      <w:pPr>
+        <w:pBdr>
+          <w:top w:val="single" w:sz="4" w:space="1" w:color="auto"/>
+          <w:left w:val="single" w:sz="4" w:space="4" w:color="auto"/>
+          <w:bottom w:val="single" w:sz="4" w:space="1" w:color="auto"/>
+          <w:right w:val="single" w:sz="4" w:space="4" w:color="auto"/>
+        </w:pBdr>
+        <w:spacing w:after="0"/>
+        <w:rPr>
+          <w:rFonts w:cs="Times New Roman"/>
+          <w:szCs w:val="28"/>
+          <w:lang w:val="uk-UA"/>
+        </w:rPr>
+      </w:pPr>
+      <w:r>
+        <w:rPr>
+          <w:rFonts w:cs="Times New Roman"/>
+          <w:szCs w:val="28"/>
+          <w:lang w:val="uk-UA"/>
+        </w:rPr>
+        <w:t xml:space="preserve">        </w:t>
+      </w:r>
+      <w:proofErr w:type="spellStart"/>
+      <w:r>
+        <w:rPr>
+          <w:rFonts w:cs="Times New Roman"/>
+          <w:szCs w:val="28"/>
+          <w:lang w:val="uk-UA"/>
+        </w:rPr>
+        <w:t>log_operation</w:t>
+      </w:r>
+      <w:proofErr w:type="spellEnd"/>
+      <w:r>
+        <w:rPr>
+          <w:rFonts w:cs="Times New Roman"/>
+          <w:szCs w:val="28"/>
+          <w:lang w:val="uk-UA"/>
+        </w:rPr>
+        <w:t xml:space="preserve">(a, b, '/', </w:t>
+      </w:r>
+      <w:proofErr w:type="spellStart"/>
+      <w:r>
+        <w:rPr>
+          <w:rFonts w:cs="Times New Roman"/>
+          <w:szCs w:val="28"/>
+          <w:lang w:val="uk-UA"/>
+        </w:rPr>
+        <w:t>result</w:t>
+      </w:r>
+      <w:proofErr w:type="spellEnd"/>
+      <w:r>
+        <w:rPr>
+          <w:rFonts w:cs="Times New Roman"/>
+          <w:szCs w:val="28"/>
+          <w:lang w:val="uk-UA"/>
+        </w:rPr>
+        <w:t xml:space="preserve">) </w:t>
+      </w:r>
+    </w:p>
+    <w:p>
+      <w:pPr>
+        <w:pBdr>
+          <w:top w:val="single" w:sz="4" w:space="1" w:color="auto"/>
+          <w:left w:val="single" w:sz="4" w:space="4" w:color="auto"/>
+          <w:bottom w:val="single" w:sz="4" w:space="1" w:color="auto"/>
+          <w:right w:val="single" w:sz="4" w:space="4" w:color="auto"/>
+        </w:pBdr>
+        <w:spacing w:after="0"/>
+        <w:rPr>
+          <w:rFonts w:cs="Times New Roman"/>
+          <w:szCs w:val="28"/>
+          <w:lang w:val="uk-UA"/>
+        </w:rPr>
+      </w:pPr>
+      <w:r>
+        <w:rPr>
+          <w:rFonts w:cs="Times New Roman"/>
+          <w:szCs w:val="28"/>
+          <w:lang w:val="uk-UA"/>
+        </w:rPr>
+        <w:t xml:space="preserve">        </w:t>
+      </w:r>
+      <w:proofErr w:type="spellStart"/>
+      <w:r>
+        <w:rPr>
+          <w:rFonts w:cs="Times New Roman"/>
+          <w:szCs w:val="28"/>
+          <w:lang w:val="uk-UA"/>
+        </w:rPr>
+        <w:t>return</w:t>
+      </w:r>
+      <w:proofErr w:type="spellEnd"/>
+      <w:r>
+        <w:rPr>
+          <w:rFonts w:cs="Times New Roman"/>
+          <w:szCs w:val="28"/>
+          <w:lang w:val="uk-UA"/>
+        </w:rPr>
+        <w:t xml:space="preserve"> </w:t>
+      </w:r>
+      <w:proofErr w:type="spellStart"/>
+      <w:r>
+        <w:rPr>
+          <w:rFonts w:cs="Times New Roman"/>
+          <w:szCs w:val="28"/>
+          <w:lang w:val="uk-UA"/>
+        </w:rPr>
+        <w:t>result</w:t>
+      </w:r>
+      <w:proofErr w:type="spellEnd"/>
+    </w:p>
+    <w:p>
+      <w:pPr>
+        <w:pBdr>
+          <w:top w:val="single" w:sz="4" w:space="1" w:color="auto"/>
+          <w:left w:val="single" w:sz="4" w:space="4" w:color="auto"/>
+          <w:bottom w:val="single" w:sz="4" w:space="1" w:color="auto"/>
+          <w:right w:val="single" w:sz="4" w:space="4" w:color="auto"/>
+        </w:pBdr>
+        <w:spacing w:after="0"/>
+        <w:rPr>
+          <w:rFonts w:cs="Times New Roman"/>
+          <w:szCs w:val="28"/>
+          <w:lang w:val="uk-UA"/>
+        </w:rPr>
+      </w:pPr>
+      <w:r>
+        <w:rPr>
+          <w:rFonts w:cs="Times New Roman"/>
+          <w:szCs w:val="28"/>
+          <w:lang w:val="uk-UA"/>
+        </w:rPr>
+        <w:t xml:space="preserve">    </w:t>
+      </w:r>
+      <w:proofErr w:type="spellStart"/>
+      <w:r>
+        <w:rPr>
+          <w:rFonts w:cs="Times New Roman"/>
+          <w:szCs w:val="28"/>
+          <w:lang w:val="uk-UA"/>
+        </w:rPr>
+        <w:t>else</w:t>
+      </w:r>
+      <w:proofErr w:type="spellEnd"/>
+      <w:r>
+        <w:rPr>
+          <w:rFonts w:cs="Times New Roman"/>
+          <w:szCs w:val="28"/>
+          <w:lang w:val="uk-UA"/>
+        </w:rPr>
+        <w:t>:</w:t>
+      </w:r>
+    </w:p>
+    <w:p>
+      <w:pPr>
+        <w:pBdr>
+          <w:top w:val="single" w:sz="4" w:space="1" w:color="auto"/>
+          <w:left w:val="single" w:sz="4" w:space="4" w:color="auto"/>
+          <w:bottom w:val="single" w:sz="4" w:space="1" w:color="auto"/>
+          <w:right w:val="single" w:sz="4" w:space="4" w:color="auto"/>
+        </w:pBdr>
+        <w:spacing w:after="0"/>
+        <w:rPr>
+          <w:rFonts w:cs="Times New Roman"/>
+          <w:szCs w:val="28"/>
+          <w:lang w:val="uk-UA"/>
+        </w:rPr>
+      </w:pPr>
+      <w:r>
+        <w:rPr>
+          <w:rFonts w:cs="Times New Roman"/>
+          <w:szCs w:val="28"/>
+          <w:lang w:val="uk-UA"/>
+        </w:rPr>
+        <w:t xml:space="preserve">        </w:t>
+      </w:r>
+      <w:proofErr w:type="spellStart"/>
+      <w:r>
+        <w:rPr>
+          <w:rFonts w:cs="Times New Roman"/>
+          <w:szCs w:val="28"/>
+          <w:lang w:val="uk-UA"/>
+        </w:rPr>
+        <w:t>error_message</w:t>
+      </w:r>
+      <w:proofErr w:type="spellEnd"/>
+      <w:r>
+        <w:rPr>
+          <w:rFonts w:cs="Times New Roman"/>
+          <w:szCs w:val="28"/>
+          <w:lang w:val="uk-UA"/>
+        </w:rPr>
+        <w:t xml:space="preserve"> = "Невірно введена операція"</w:t>
+      </w:r>
+    </w:p>
+    <w:p>
+      <w:pPr>
+        <w:pBdr>
+          <w:top w:val="single" w:sz="4" w:space="1" w:color="auto"/>
+          <w:left w:val="single" w:sz="4" w:space="4" w:color="auto"/>
+          <w:bottom w:val="single" w:sz="4" w:space="1" w:color="auto"/>
+          <w:right w:val="single" w:sz="4" w:space="4" w:color="auto"/>
+        </w:pBdr>
+        <w:spacing w:after="0"/>
+        <w:rPr>
+          <w:rFonts w:cs="Times New Roman"/>
+          <w:szCs w:val="28"/>
+          <w:lang w:val="uk-UA"/>
+        </w:rPr>
+      </w:pPr>
+      <w:r>
+        <w:rPr>
+          <w:rFonts w:cs="Times New Roman"/>
+          <w:szCs w:val="28"/>
+          <w:lang w:val="uk-UA"/>
+        </w:rPr>
+        <w:t xml:space="preserve">        </w:t>
+      </w:r>
+      <w:proofErr w:type="spellStart"/>
+      <w:r>
+        <w:rPr>
+          <w:rFonts w:cs="Times New Roman"/>
+          <w:szCs w:val="28"/>
+          <w:lang w:val="uk-UA"/>
+        </w:rPr>
+        <w:t>log_operation</w:t>
+      </w:r>
+      <w:proofErr w:type="spellEnd"/>
+      <w:r>
+        <w:rPr>
+          <w:rFonts w:cs="Times New Roman"/>
+          <w:szCs w:val="28"/>
+          <w:lang w:val="uk-UA"/>
+        </w:rPr>
+        <w:t xml:space="preserve">(a, b, f, </w:t>
+      </w:r>
+      <w:proofErr w:type="spellStart"/>
+      <w:r>
+        <w:rPr>
+          <w:rFonts w:cs="Times New Roman"/>
+          <w:szCs w:val="28"/>
+          <w:lang w:val="uk-UA"/>
+        </w:rPr>
+        <w:t>error_message</w:t>
+      </w:r>
+      <w:proofErr w:type="spellEnd"/>
+      <w:r>
+        <w:rPr>
+          <w:rFonts w:cs="Times New Roman"/>
+          <w:szCs w:val="28"/>
+          <w:lang w:val="uk-UA"/>
+        </w:rPr>
+        <w:t xml:space="preserve">) </w:t>
+      </w:r>
+    </w:p>
+    <w:p>
+      <w:pPr>
+        <w:pBdr>
+          <w:top w:val="single" w:sz="4" w:space="1" w:color="auto"/>
+          <w:left w:val="single" w:sz="4" w:space="4" w:color="auto"/>
+          <w:bottom w:val="single" w:sz="4" w:space="1" w:color="auto"/>
+          <w:right w:val="single" w:sz="4" w:space="4" w:color="auto"/>
+        </w:pBdr>
+        <w:spacing w:after="0"/>
+        <w:rPr>
+          <w:rFonts w:cs="Times New Roman"/>
+          <w:szCs w:val="28"/>
+          <w:lang w:val="uk-UA"/>
+        </w:rPr>
+      </w:pPr>
+      <w:r>
+        <w:rPr>
+          <w:rFonts w:cs="Times New Roman"/>
+          <w:szCs w:val="28"/>
+          <w:lang w:val="uk-UA"/>
+        </w:rPr>
+        <w:t xml:space="preserve">        </w:t>
+      </w:r>
+      <w:proofErr w:type="spellStart"/>
+      <w:r>
+        <w:rPr>
+          <w:rFonts w:cs="Times New Roman"/>
+          <w:szCs w:val="28"/>
+          <w:lang w:val="uk-UA"/>
+        </w:rPr>
+        <w:t>return</w:t>
+      </w:r>
+      <w:proofErr w:type="spellEnd"/>
+      <w:r>
+        <w:rPr>
+          <w:rFonts w:cs="Times New Roman"/>
+          <w:szCs w:val="28"/>
+          <w:lang w:val="uk-UA"/>
+        </w:rPr>
+        <w:t xml:space="preserve"> </w:t>
+      </w:r>
+      <w:proofErr w:type="spellStart"/>
+      <w:r>
+        <w:rPr>
+          <w:rFonts w:cs="Times New Roman"/>
+          <w:szCs w:val="28"/>
+          <w:lang w:val="uk-UA"/>
+        </w:rPr>
+        <w:t>error_message</w:t>
+      </w:r>
+      <w:proofErr w:type="spellEnd"/>
+    </w:p>
+    <w:p>
+      <w:pPr>
+        <w:pBdr>
+          <w:top w:val="single" w:sz="4" w:space="1" w:color="auto"/>
+          <w:left w:val="single" w:sz="4" w:space="4" w:color="auto"/>
+          <w:bottom w:val="single" w:sz="4" w:space="1" w:color="auto"/>
+          <w:right w:val="single" w:sz="4" w:space="4" w:color="auto"/>
+        </w:pBdr>
+        <w:spacing w:after="0"/>
+        <w:rPr>
+          <w:rFonts w:cs="Times New Roman"/>
+          <w:szCs w:val="28"/>
+          <w:lang w:val="uk-UA"/>
+        </w:rPr>
+      </w:pPr>
+      <w:proofErr w:type="spellStart"/>
+      <w:r>
+        <w:rPr>
+          <w:rFonts w:cs="Times New Roman"/>
+          <w:szCs w:val="28"/>
+          <w:lang w:val="uk-UA"/>
+        </w:rPr>
+        <w:t>def</w:t>
+      </w:r>
+      <w:proofErr w:type="spellEnd"/>
+      <w:r>
+        <w:rPr>
+          <w:rFonts w:cs="Times New Roman"/>
+          <w:szCs w:val="28"/>
+          <w:lang w:val="uk-UA"/>
+        </w:rPr>
+        <w:t xml:space="preserve"> </w:t>
+      </w:r>
+      <w:proofErr w:type="spellStart"/>
+      <w:r>
+        <w:rPr>
+          <w:rFonts w:cs="Times New Roman"/>
+          <w:szCs w:val="28"/>
+          <w:lang w:val="uk-UA"/>
+        </w:rPr>
+        <w:t>run_calculator</w:t>
+      </w:r>
+      <w:proofErr w:type="spellEnd"/>
+      <w:r>
+        <w:rPr>
+          <w:rFonts w:cs="Times New Roman"/>
+          <w:szCs w:val="28"/>
+          <w:lang w:val="uk-UA"/>
+        </w:rPr>
+        <w:t>():</w:t>
+      </w:r>
+    </w:p>
+    <w:p>
+      <w:pPr>
+        <w:pBdr>
+          <w:top w:val="single" w:sz="4" w:space="1" w:color="auto"/>
+          <w:left w:val="single" w:sz="4" w:space="4" w:color="auto"/>
+          <w:bottom w:val="single" w:sz="4" w:space="1" w:color="auto"/>
+          <w:right w:val="single" w:sz="4" w:space="4" w:color="auto"/>
+        </w:pBdr>
+        <w:spacing w:after="0"/>
+        <w:rPr>
+          <w:rFonts w:cs="Times New Roman"/>
+          <w:szCs w:val="28"/>
+          <w:lang w:val="uk-UA"/>
+        </w:rPr>
+      </w:pPr>
+      <w:r>
+        <w:rPr>
+          <w:rFonts w:cs="Times New Roman"/>
+          <w:szCs w:val="28"/>
+          <w:lang w:val="uk-UA"/>
+        </w:rPr>
+        <w:t xml:space="preserve">    a, b = </w:t>
+      </w:r>
+      <w:proofErr w:type="spellStart"/>
+      <w:r>
+        <w:rPr>
+          <w:rFonts w:cs="Times New Roman"/>
+          <w:szCs w:val="28"/>
+          <w:lang w:val="uk-UA"/>
+        </w:rPr>
+        <w:t>input_numbers</w:t>
+      </w:r>
+      <w:proofErr w:type="spellEnd"/>
+      <w:r>
+        <w:rPr>
+          <w:rFonts w:cs="Times New Roman"/>
+          <w:szCs w:val="28"/>
+          <w:lang w:val="uk-UA"/>
+        </w:rPr>
+        <w:t>()</w:t>
+      </w:r>
+    </w:p>
+    <w:p>
+      <w:pPr>
+        <w:pBdr>
+          <w:top w:val="single" w:sz="4" w:space="1" w:color="auto"/>
+          <w:left w:val="single" w:sz="4" w:space="4" w:color="auto"/>
+          <w:bottom w:val="single" w:sz="4" w:space="1" w:color="auto"/>
+          <w:right w:val="single" w:sz="4" w:space="4" w:color="auto"/>
+        </w:pBdr>
+        <w:spacing w:after="0"/>
+        <w:rPr>
+          <w:rFonts w:cs="Times New Roman"/>
+          <w:szCs w:val="28"/>
+          <w:lang w:val="uk-UA"/>
+        </w:rPr>
+      </w:pPr>
+      <w:r>
+        <w:rPr>
+          <w:rFonts w:cs="Times New Roman"/>
+          <w:szCs w:val="28"/>
+          <w:lang w:val="uk-UA"/>
+        </w:rPr>
+        <w:t xml:space="preserve">    f = </w:t>
+      </w:r>
+      <w:proofErr w:type="spellStart"/>
+      <w:r>
+        <w:rPr>
+          <w:rFonts w:cs="Times New Roman"/>
+          <w:szCs w:val="28"/>
+          <w:lang w:val="uk-UA"/>
+        </w:rPr>
+        <w:t>input_operation</w:t>
+      </w:r>
+      <w:proofErr w:type="spellEnd"/>
+      <w:r>
+        <w:rPr>
+          <w:rFonts w:cs="Times New Roman"/>
+          <w:szCs w:val="28"/>
+          <w:lang w:val="uk-UA"/>
+        </w:rPr>
+        <w:t>()</w:t>
+      </w:r>
+    </w:p>
+    <w:p>
+      <w:pPr>
+        <w:pBdr>
+          <w:top w:val="single" w:sz="4" w:space="1" w:color="auto"/>
+          <w:left w:val="single" w:sz="4" w:space="4" w:color="auto"/>
+          <w:bottom w:val="single" w:sz="4" w:space="1" w:color="auto"/>
+          <w:right w:val="single" w:sz="4" w:space="4" w:color="auto"/>
+        </w:pBdr>
+        <w:spacing w:after="0"/>
+        <w:rPr>
+          <w:rFonts w:cs="Times New Roman"/>
+          <w:szCs w:val="28"/>
+          <w:lang w:val="uk-UA"/>
+        </w:rPr>
+      </w:pPr>
+      <w:r>
+        <w:rPr>
+          <w:rFonts w:cs="Times New Roman"/>
+          <w:szCs w:val="28"/>
+          <w:lang w:val="uk-UA"/>
+        </w:rPr>
+        <w:t xml:space="preserve">    </w:t>
+      </w:r>
+      <w:proofErr w:type="spellStart"/>
+      <w:r>
+        <w:rPr>
+          <w:rFonts w:cs="Times New Roman"/>
+          <w:szCs w:val="28"/>
+          <w:lang w:val="uk-UA"/>
+        </w:rPr>
+        <w:t>result</w:t>
+      </w:r>
+      <w:proofErr w:type="spellEnd"/>
+      <w:r>
+        <w:rPr>
+          <w:rFonts w:cs="Times New Roman"/>
+          <w:szCs w:val="28"/>
+          <w:lang w:val="uk-UA"/>
+        </w:rPr>
+        <w:t xml:space="preserve"> = </w:t>
+      </w:r>
+      <w:proofErr w:type="spellStart"/>
+      <w:r>
+        <w:rPr>
+          <w:rFonts w:cs="Times New Roman"/>
+          <w:szCs w:val="28"/>
+          <w:lang w:val="uk-UA"/>
+        </w:rPr>
+        <w:t>do_operation</w:t>
+      </w:r>
+      <w:proofErr w:type="spellEnd"/>
+      <w:r>
+        <w:rPr>
+          <w:rFonts w:cs="Times New Roman"/>
+          <w:szCs w:val="28"/>
+          <w:lang w:val="uk-UA"/>
+        </w:rPr>
+        <w:t>(a, b, f)</w:t>
+      </w:r>
+    </w:p>
+    <w:p>
+      <w:pPr>
+        <w:pBdr>
+          <w:top w:val="single" w:sz="4" w:space="1" w:color="auto"/>
+          <w:left w:val="single" w:sz="4" w:space="4" w:color="auto"/>
+          <w:bottom w:val="single" w:sz="4" w:space="1" w:color="auto"/>
+          <w:right w:val="single" w:sz="4" w:space="4" w:color="auto"/>
+        </w:pBdr>
+        <w:spacing w:after="0"/>
+        <w:rPr>
+          <w:rFonts w:cs="Times New Roman"/>
+          <w:szCs w:val="28"/>
+          <w:lang w:val="uk-UA"/>
+        </w:rPr>
+      </w:pPr>
+      <w:r>
+        <w:rPr>
+          <w:rFonts w:cs="Times New Roman"/>
+          <w:szCs w:val="28"/>
+          <w:lang w:val="uk-UA"/>
+        </w:rPr>
+        <w:t xml:space="preserve">    </w:t>
+      </w:r>
+      <w:proofErr w:type="spellStart"/>
+      <w:r>
+        <w:rPr>
+          <w:rFonts w:cs="Times New Roman"/>
+          <w:szCs w:val="28"/>
+          <w:lang w:val="uk-UA"/>
+        </w:rPr>
+        <w:t>print</w:t>
+      </w:r>
+      <w:proofErr w:type="spellEnd"/>
+      <w:r>
+        <w:rPr>
+          <w:rFonts w:cs="Times New Roman"/>
+          <w:szCs w:val="28"/>
+          <w:lang w:val="uk-UA"/>
+        </w:rPr>
+        <w:t>(</w:t>
+      </w:r>
+      <w:proofErr w:type="spellStart"/>
+      <w:r>
+        <w:rPr>
+          <w:rFonts w:cs="Times New Roman"/>
+          <w:szCs w:val="28"/>
+          <w:lang w:val="uk-UA"/>
+        </w:rPr>
+        <w:t>result</w:t>
+      </w:r>
+      <w:proofErr w:type="spellEnd"/>
+      <w:r>
+        <w:rPr>
+          <w:rFonts w:cs="Times New Roman"/>
+          <w:szCs w:val="28"/>
+          <w:lang w:val="uk-UA"/>
+        </w:rPr>
+        <w:t>)</w:t>
+      </w:r>
+    </w:p>
+    <w:p>
+      <w:pPr>
+        <w:pBdr>
+          <w:top w:val="single" w:sz="4" w:space="1" w:color="auto"/>
+          <w:left w:val="single" w:sz="4" w:space="4" w:color="auto"/>
+          <w:bottom w:val="single" w:sz="4" w:space="1" w:color="auto"/>
+          <w:right w:val="single" w:sz="4" w:space="4" w:color="auto"/>
+        </w:pBdr>
+        <w:spacing w:after="0"/>
+        <w:rPr>
+          <w:rFonts w:cs="Times New Roman"/>
+          <w:szCs w:val="28"/>
+          <w:lang w:val="uk-UA"/>
+        </w:rPr>
+      </w:pPr>
+      <w:proofErr w:type="spellStart"/>
+      <w:r>
+        <w:rPr>
+          <w:rFonts w:cs="Times New Roman"/>
+          <w:szCs w:val="28"/>
+          <w:lang w:val="uk-UA"/>
+        </w:rPr>
+        <w:t>def</w:t>
+      </w:r>
+      <w:proofErr w:type="spellEnd"/>
+      <w:r>
+        <w:rPr>
+          <w:rFonts w:cs="Times New Roman"/>
+          <w:szCs w:val="28"/>
+          <w:lang w:val="uk-UA"/>
+        </w:rPr>
+        <w:t xml:space="preserve"> </w:t>
+      </w:r>
+      <w:proofErr w:type="spellStart"/>
+      <w:r>
+        <w:rPr>
+          <w:rFonts w:cs="Times New Roman"/>
+          <w:szCs w:val="28"/>
+          <w:lang w:val="uk-UA"/>
+        </w:rPr>
+        <w:t>log_operation</w:t>
+      </w:r>
+      <w:proofErr w:type="spellEnd"/>
+      <w:r>
+        <w:rPr>
+          <w:rFonts w:cs="Times New Roman"/>
+          <w:szCs w:val="28"/>
+          <w:lang w:val="uk-UA"/>
+        </w:rPr>
+        <w:t xml:space="preserve">(a, b, </w:t>
+      </w:r>
+      <w:proofErr w:type="spellStart"/>
+      <w:r>
+        <w:rPr>
+          <w:rFonts w:cs="Times New Roman"/>
+          <w:szCs w:val="28"/>
+          <w:lang w:val="uk-UA"/>
+        </w:rPr>
+        <w:t>operation</w:t>
+      </w:r>
+      <w:proofErr w:type="spellEnd"/>
+      <w:r>
+        <w:rPr>
+          <w:rFonts w:cs="Times New Roman"/>
+          <w:szCs w:val="28"/>
+          <w:lang w:val="uk-UA"/>
+        </w:rPr>
+        <w:t xml:space="preserve">, </w:t>
+      </w:r>
+      <w:proofErr w:type="spellStart"/>
+      <w:r>
+        <w:rPr>
+          <w:rFonts w:cs="Times New Roman"/>
+          <w:szCs w:val="28"/>
+          <w:lang w:val="uk-UA"/>
+        </w:rPr>
+        <w:t>result</w:t>
+      </w:r>
+      <w:proofErr w:type="spellEnd"/>
+      <w:r>
+        <w:rPr>
+          <w:rFonts w:cs="Times New Roman"/>
+          <w:szCs w:val="28"/>
+          <w:lang w:val="uk-UA"/>
+        </w:rPr>
+        <w:t>):</w:t>
+      </w:r>
+    </w:p>
+    <w:p>
+      <w:pPr>
+        <w:pBdr>
+          <w:top w:val="single" w:sz="4" w:space="1" w:color="auto"/>
+          <w:left w:val="single" w:sz="4" w:space="4" w:color="auto"/>
+          <w:bottom w:val="single" w:sz="4" w:space="1" w:color="auto"/>
+          <w:right w:val="single" w:sz="4" w:space="4" w:color="auto"/>
+        </w:pBdr>
+        <w:spacing w:after="0"/>
+        <w:rPr>
+          <w:rFonts w:cs="Times New Roman"/>
+          <w:szCs w:val="28"/>
+          <w:lang w:val="uk-UA"/>
+        </w:rPr>
+      </w:pPr>
+      <w:r>
+        <w:rPr>
+          <w:rFonts w:cs="Times New Roman"/>
+          <w:szCs w:val="28"/>
+          <w:lang w:val="uk-UA"/>
+        </w:rPr>
+        <w:t xml:space="preserve">    logging.info(</w:t>
+      </w:r>
+      <w:proofErr w:type="spellStart"/>
+      <w:r>
+        <w:rPr>
+          <w:rFonts w:cs="Times New Roman"/>
+          <w:szCs w:val="28"/>
+          <w:lang w:val="uk-UA"/>
+        </w:rPr>
+        <w:t>f'User</w:t>
+      </w:r>
+      <w:proofErr w:type="spellEnd"/>
+      <w:r>
+        <w:rPr>
+          <w:rFonts w:cs="Times New Roman"/>
+          <w:szCs w:val="28"/>
+          <w:lang w:val="uk-UA"/>
+        </w:rPr>
+        <w:t xml:space="preserve"> </w:t>
+      </w:r>
+      <w:proofErr w:type="spellStart"/>
+      <w:r>
+        <w:rPr>
+          <w:rFonts w:cs="Times New Roman"/>
+          <w:szCs w:val="28"/>
+          <w:lang w:val="uk-UA"/>
+        </w:rPr>
+        <w:t>input</w:t>
+      </w:r>
+      <w:proofErr w:type="spellEnd"/>
+      <w:r>
+        <w:rPr>
+          <w:rFonts w:cs="Times New Roman"/>
+          <w:szCs w:val="28"/>
+          <w:lang w:val="uk-UA"/>
+        </w:rPr>
+        <w:t xml:space="preserve">: a={a}, b={b}, </w:t>
+      </w:r>
+      <w:proofErr w:type="spellStart"/>
+      <w:r>
+        <w:rPr>
+          <w:rFonts w:cs="Times New Roman"/>
+          <w:szCs w:val="28"/>
+          <w:lang w:val="uk-UA"/>
+        </w:rPr>
+        <w:t>operation</w:t>
+      </w:r>
+      <w:proofErr w:type="spellEnd"/>
+      <w:r>
+        <w:rPr>
+          <w:rFonts w:cs="Times New Roman"/>
+          <w:szCs w:val="28"/>
+          <w:lang w:val="uk-UA"/>
+        </w:rPr>
+        <w:t>={</w:t>
+      </w:r>
+      <w:proofErr w:type="spellStart"/>
+      <w:r>
+        <w:rPr>
+          <w:rFonts w:cs="Times New Roman"/>
+          <w:szCs w:val="28"/>
+          <w:lang w:val="uk-UA"/>
+        </w:rPr>
+        <w:t>operation</w:t>
+      </w:r>
+      <w:proofErr w:type="spellEnd"/>
+      <w:r>
+        <w:rPr>
+          <w:rFonts w:cs="Times New Roman"/>
+          <w:szCs w:val="28"/>
+          <w:lang w:val="uk-UA"/>
+        </w:rPr>
+        <w:t xml:space="preserve">}, </w:t>
+      </w:r>
+      <w:proofErr w:type="spellStart"/>
+      <w:r>
+        <w:rPr>
+          <w:rFonts w:cs="Times New Roman"/>
+          <w:szCs w:val="28"/>
+          <w:lang w:val="uk-UA"/>
+        </w:rPr>
+        <w:t>result</w:t>
+      </w:r>
+      <w:proofErr w:type="spellEnd"/>
+      <w:r>
+        <w:rPr>
+          <w:rFonts w:cs="Times New Roman"/>
+          <w:szCs w:val="28"/>
+          <w:lang w:val="uk-UA"/>
+        </w:rPr>
+        <w:t>={</w:t>
+      </w:r>
+      <w:proofErr w:type="spellStart"/>
+      <w:r>
+        <w:rPr>
+          <w:rFonts w:cs="Times New Roman"/>
+          <w:szCs w:val="28"/>
+          <w:lang w:val="uk-UA"/>
+        </w:rPr>
+        <w:t>result</w:t>
+      </w:r>
+      <w:proofErr w:type="spellEnd"/>
+      <w:r>
+        <w:rPr>
+          <w:rFonts w:cs="Times New Roman"/>
+          <w:szCs w:val="28"/>
+          <w:lang w:val="uk-UA"/>
+        </w:rPr>
+        <w:t>}')</w:t>
+      </w:r>
+      <w:r>
+        <w:rPr>
+          <w:rFonts w:cs="Times New Roman"/>
+          <w:szCs w:val="28"/>
+          <w:lang w:val="uk-UA"/>
+        </w:rPr>
+        <w:t xml:space="preserve"> </w:t>
+      </w:r>
+    </w:p>
+    <w:p>
+      <w:pPr>
+        <w:spacing w:after="0"/>
+        <w:rPr>
+          <w:rFonts w:cs="Times New Roman"/>
+          <w:szCs w:val="28"/>
+          <w:lang w:val="uk-UA"/>
+        </w:rPr>
+      </w:pPr>
+      <w:r>
+        <w:rPr>
+          <w:rFonts w:cs="Times New Roman"/>
+          <w:szCs w:val="28"/>
+          <w:lang w:val="uk-UA"/>
+        </w:rPr>
+        <w:t>Результат</w:t>
+      </w:r>
+      <w:r>
+        <w:rPr>
+          <w:rFonts w:cs="Times New Roman"/>
+          <w:szCs w:val="28"/>
+          <w:lang w:val="uk-UA"/>
+        </w:rPr>
+        <w:t>:</w:t>
+      </w:r>
+    </w:p>
+    <w:p>
+      <w:pPr>
+        <w:spacing w:after="0"/>
+        <w:rPr>
+          <w:rFonts w:cs="Times New Roman"/>
+          <w:szCs w:val="28"/>
+          <w:lang w:val="uk-UA"/>
+        </w:rPr>
+      </w:pPr>
+      <w:r>
+        <w:rPr>
+          <w:rFonts w:cs="Times New Roman"/>
+          <w:szCs w:val="28"/>
+          <w:lang w:val="uk-UA"/>
+        </w:rPr>
+        <w:drawing>
+          <wp:inline distT="0" distB="0" distL="0" distR="0" wp14:anchorId="4C6BE35D" wp14:editId="1F48A66A">
+            <wp:extent cx="5943600" cy="1036955"/>
+            <wp:effectExtent l="0" t="0" r="0" b="0"/>
+            <wp:docPr id="5" name="Рисунок 5"/>
+            <wp:cNvGraphicFramePr>
+              <a:graphicFrameLocks xmlns:a="http://schemas.openxmlformats.org/drawingml/2006/main" noChangeAspect="1"/>
+            </wp:cNvGraphicFramePr>
+            <a:graphic xmlns:a="http://schemas.openxmlformats.org/drawingml/2006/main">
+              <a:graphicData uri="http://schemas.openxmlformats.org/drawingml/2006/picture">
+                <pic:pic xmlns:pic="http://schemas.openxmlformats.org/drawingml/2006/picture">
+                  <pic:nvPicPr>
+                    <pic:cNvPr id="1" name=""/>
+                    <pic:cNvPicPr/>
+                  </pic:nvPicPr>
+                  <pic:blipFill>
+                    <a:blip r:embed="rId24"/>
+                    <a:stretch>
+                      <a:fillRect/>
+                    </a:stretch>
+                  </pic:blipFill>
+                  <pic:spPr>
+                    <a:xfrm>
+                      <a:off x="0" y="0"/>
+                      <a:ext cx="5943600" cy="1036955"/>
+                    </a:xfrm>
+                    <a:prstGeom prst="rect">
+                      <a:avLst/>
+                    </a:prstGeom>
+                  </pic:spPr>
+                </pic:pic>
+              </a:graphicData>
+            </a:graphic>
+          </wp:inline>
+        </w:drawing>
+      </w:r>
+    </w:p>
+    <w:p>
+      <w:pPr>
+        <w:pStyle w:val="a4"/>
+        <w:numPr>
+          <w:ilvl w:val="0"/>
+          <w:numId w:val="7"/>
+        </w:numPr>
+        <w:spacing w:after="0"/>
+        <w:rPr>
+          <w:rFonts w:cs="Times New Roman"/>
+          <w:szCs w:val="28"/>
+          <w:lang w:val="uk-UA"/>
+        </w:rPr>
+      </w:pPr>
+      <w:r>
+        <w:rPr>
+          <w:lang w:val="uk-UA"/>
+        </w:rPr>
+        <w:t>С</w:t>
+      </w:r>
       <w:bookmarkStart w:id="0" w:name="_GoBack"/>
       <w:bookmarkEnd w:id="0"/>
-    </w:p>
-    <w:p>
-      <w:pPr>
-        <w:spacing w:after="0"/>
-        <w:rPr>
-          <w:rFonts w:cs="Times New Roman"/>
-          <w:szCs w:val="28"/>
-          <w:lang w:val="uk-UA"/>
-        </w:rPr>
-      </w:pPr>
+      <w:r>
+        <w:rPr>
+          <w:lang w:val="uk-UA"/>
+        </w:rPr>
+        <w:t>ортування списку</w:t>
+      </w:r>
+    </w:p>
+    <w:p>
+      <w:pPr>
+        <w:pBdr>
+          <w:top w:val="single" w:sz="4" w:space="1" w:color="auto"/>
+          <w:left w:val="single" w:sz="4" w:space="4" w:color="auto"/>
+          <w:bottom w:val="single" w:sz="4" w:space="1" w:color="auto"/>
+          <w:right w:val="single" w:sz="4" w:space="4" w:color="auto"/>
+        </w:pBdr>
+        <w:spacing w:after="0"/>
+        <w:rPr>
+          <w:rFonts w:cs="Times New Roman"/>
+          <w:szCs w:val="28"/>
+          <w:lang w:val="uk-UA"/>
+        </w:rPr>
+      </w:pPr>
+      <w:proofErr w:type="spellStart"/>
+      <w:r>
+        <w:rPr>
+          <w:rFonts w:cs="Times New Roman"/>
+          <w:szCs w:val="28"/>
+          <w:lang w:val="uk-UA"/>
+        </w:rPr>
+        <w:t>import</w:t>
+      </w:r>
+      <w:proofErr w:type="spellEnd"/>
+      <w:r>
+        <w:rPr>
+          <w:rFonts w:cs="Times New Roman"/>
+          <w:szCs w:val="28"/>
+          <w:lang w:val="uk-UA"/>
+        </w:rPr>
+        <w:t xml:space="preserve"> </w:t>
+      </w:r>
+      <w:proofErr w:type="spellStart"/>
+      <w:r>
+        <w:rPr>
+          <w:rFonts w:cs="Times New Roman"/>
+          <w:szCs w:val="28"/>
+          <w:lang w:val="uk-UA"/>
+        </w:rPr>
+        <w:t>locale</w:t>
+      </w:r>
+      <w:proofErr w:type="spellEnd"/>
+    </w:p>
+    <w:p>
+      <w:pPr>
+        <w:pBdr>
+          <w:top w:val="single" w:sz="4" w:space="1" w:color="auto"/>
+          <w:left w:val="single" w:sz="4" w:space="4" w:color="auto"/>
+          <w:bottom w:val="single" w:sz="4" w:space="1" w:color="auto"/>
+          <w:right w:val="single" w:sz="4" w:space="4" w:color="auto"/>
+        </w:pBdr>
+        <w:spacing w:after="0"/>
+        <w:rPr>
+          <w:rFonts w:cs="Times New Roman"/>
+          <w:szCs w:val="28"/>
+          <w:lang w:val="uk-UA"/>
+        </w:rPr>
+      </w:pPr>
+      <w:proofErr w:type="spellStart"/>
+      <w:r>
+        <w:rPr>
+          <w:rFonts w:cs="Times New Roman"/>
+          <w:szCs w:val="28"/>
+          <w:lang w:val="uk-UA"/>
+        </w:rPr>
+        <w:t>students</w:t>
+      </w:r>
+      <w:proofErr w:type="spellEnd"/>
+      <w:r>
+        <w:rPr>
+          <w:rFonts w:cs="Times New Roman"/>
+          <w:szCs w:val="28"/>
+          <w:lang w:val="uk-UA"/>
+        </w:rPr>
+        <w:t xml:space="preserve"> = [</w:t>
+      </w:r>
+    </w:p>
+    <w:p>
+      <w:pPr>
+        <w:pBdr>
+          <w:top w:val="single" w:sz="4" w:space="1" w:color="auto"/>
+          <w:left w:val="single" w:sz="4" w:space="4" w:color="auto"/>
+          <w:bottom w:val="single" w:sz="4" w:space="1" w:color="auto"/>
+          <w:right w:val="single" w:sz="4" w:space="4" w:color="auto"/>
+        </w:pBdr>
+        <w:spacing w:after="0"/>
+        <w:rPr>
+          <w:rFonts w:cs="Times New Roman"/>
+          <w:szCs w:val="28"/>
+          <w:lang w:val="uk-UA"/>
+        </w:rPr>
+      </w:pPr>
+      <w:r>
+        <w:rPr>
+          <w:rFonts w:cs="Times New Roman"/>
+          <w:szCs w:val="28"/>
+          <w:lang w:val="uk-UA"/>
+        </w:rPr>
+        <w:t xml:space="preserve">    {"</w:t>
+      </w:r>
+      <w:proofErr w:type="spellStart"/>
+      <w:r>
+        <w:rPr>
+          <w:rFonts w:cs="Times New Roman"/>
+          <w:szCs w:val="28"/>
+          <w:lang w:val="uk-UA"/>
+        </w:rPr>
+        <w:t>name</w:t>
+      </w:r>
+      <w:proofErr w:type="spellEnd"/>
+      <w:r>
+        <w:rPr>
+          <w:rFonts w:cs="Times New Roman"/>
+          <w:szCs w:val="28"/>
+          <w:lang w:val="uk-UA"/>
+        </w:rPr>
+        <w:t>": "Іван", "</w:t>
+      </w:r>
+      <w:proofErr w:type="spellStart"/>
+      <w:r>
+        <w:rPr>
+          <w:rFonts w:cs="Times New Roman"/>
+          <w:szCs w:val="28"/>
+          <w:lang w:val="uk-UA"/>
+        </w:rPr>
+        <w:t>grade</w:t>
+      </w:r>
+      <w:proofErr w:type="spellEnd"/>
+      <w:r>
+        <w:rPr>
+          <w:rFonts w:cs="Times New Roman"/>
+          <w:szCs w:val="28"/>
+          <w:lang w:val="uk-UA"/>
+        </w:rPr>
+        <w:t>": 10},</w:t>
+      </w:r>
+    </w:p>
+    <w:p>
+      <w:pPr>
+        <w:pBdr>
+          <w:top w:val="single" w:sz="4" w:space="1" w:color="auto"/>
+          <w:left w:val="single" w:sz="4" w:space="4" w:color="auto"/>
+          <w:bottom w:val="single" w:sz="4" w:space="1" w:color="auto"/>
+          <w:right w:val="single" w:sz="4" w:space="4" w:color="auto"/>
+        </w:pBdr>
+        <w:spacing w:after="0"/>
+        <w:rPr>
+          <w:rFonts w:cs="Times New Roman"/>
+          <w:szCs w:val="28"/>
+          <w:lang w:val="uk-UA"/>
+        </w:rPr>
+      </w:pPr>
+      <w:r>
+        <w:rPr>
+          <w:rFonts w:cs="Times New Roman"/>
+          <w:szCs w:val="28"/>
+          <w:lang w:val="uk-UA"/>
+        </w:rPr>
+        <w:t xml:space="preserve">    {"</w:t>
+      </w:r>
+      <w:proofErr w:type="spellStart"/>
+      <w:r>
+        <w:rPr>
+          <w:rFonts w:cs="Times New Roman"/>
+          <w:szCs w:val="28"/>
+          <w:lang w:val="uk-UA"/>
+        </w:rPr>
+        <w:t>name</w:t>
+      </w:r>
+      <w:proofErr w:type="spellEnd"/>
+      <w:r>
+        <w:rPr>
+          <w:rFonts w:cs="Times New Roman"/>
+          <w:szCs w:val="28"/>
+          <w:lang w:val="uk-UA"/>
+        </w:rPr>
+        <w:t>": "Оля", "</w:t>
+      </w:r>
+      <w:proofErr w:type="spellStart"/>
+      <w:r>
+        <w:rPr>
+          <w:rFonts w:cs="Times New Roman"/>
+          <w:szCs w:val="28"/>
+          <w:lang w:val="uk-UA"/>
+        </w:rPr>
+        <w:t>grade</w:t>
+      </w:r>
+      <w:proofErr w:type="spellEnd"/>
+      <w:r>
+        <w:rPr>
+          <w:rFonts w:cs="Times New Roman"/>
+          <w:szCs w:val="28"/>
+          <w:lang w:val="uk-UA"/>
+        </w:rPr>
+        <w:t>": 6},</w:t>
+      </w:r>
+    </w:p>
+    <w:p>
+      <w:pPr>
+        <w:pBdr>
+          <w:top w:val="single" w:sz="4" w:space="1" w:color="auto"/>
+          <w:left w:val="single" w:sz="4" w:space="4" w:color="auto"/>
+          <w:bottom w:val="single" w:sz="4" w:space="1" w:color="auto"/>
+          <w:right w:val="single" w:sz="4" w:space="4" w:color="auto"/>
+        </w:pBdr>
+        <w:spacing w:after="0"/>
+        <w:rPr>
+          <w:rFonts w:cs="Times New Roman"/>
+          <w:szCs w:val="28"/>
+          <w:lang w:val="uk-UA"/>
+        </w:rPr>
+      </w:pPr>
+      <w:r>
+        <w:rPr>
+          <w:rFonts w:cs="Times New Roman"/>
+          <w:szCs w:val="28"/>
+          <w:lang w:val="uk-UA"/>
+        </w:rPr>
+        <w:t xml:space="preserve">    {"</w:t>
+      </w:r>
+      <w:proofErr w:type="spellStart"/>
+      <w:r>
+        <w:rPr>
+          <w:rFonts w:cs="Times New Roman"/>
+          <w:szCs w:val="28"/>
+          <w:lang w:val="uk-UA"/>
+        </w:rPr>
+        <w:t>name</w:t>
+      </w:r>
+      <w:proofErr w:type="spellEnd"/>
+      <w:r>
+        <w:rPr>
+          <w:rFonts w:cs="Times New Roman"/>
+          <w:szCs w:val="28"/>
+          <w:lang w:val="uk-UA"/>
+        </w:rPr>
+        <w:t>": "Андрій", "</w:t>
+      </w:r>
+      <w:proofErr w:type="spellStart"/>
+      <w:r>
+        <w:rPr>
+          <w:rFonts w:cs="Times New Roman"/>
+          <w:szCs w:val="28"/>
+          <w:lang w:val="uk-UA"/>
+        </w:rPr>
+        <w:t>grade</w:t>
+      </w:r>
+      <w:proofErr w:type="spellEnd"/>
+      <w:r>
+        <w:rPr>
+          <w:rFonts w:cs="Times New Roman"/>
+          <w:szCs w:val="28"/>
+          <w:lang w:val="uk-UA"/>
+        </w:rPr>
+        <w:t>": 8},</w:t>
+      </w:r>
+    </w:p>
+    <w:p>
+      <w:pPr>
+        <w:pBdr>
+          <w:top w:val="single" w:sz="4" w:space="1" w:color="auto"/>
+          <w:left w:val="single" w:sz="4" w:space="4" w:color="auto"/>
+          <w:bottom w:val="single" w:sz="4" w:space="1" w:color="auto"/>
+          <w:right w:val="single" w:sz="4" w:space="4" w:color="auto"/>
+        </w:pBdr>
+        <w:spacing w:after="0"/>
+        <w:rPr>
+          <w:rFonts w:cs="Times New Roman"/>
+          <w:szCs w:val="28"/>
+          <w:lang w:val="uk-UA"/>
+        </w:rPr>
+      </w:pPr>
+      <w:r>
+        <w:rPr>
+          <w:rFonts w:cs="Times New Roman"/>
+          <w:szCs w:val="28"/>
+          <w:lang w:val="uk-UA"/>
+        </w:rPr>
+        <w:lastRenderedPageBreak/>
+        <w:t xml:space="preserve">    {"</w:t>
+      </w:r>
+      <w:proofErr w:type="spellStart"/>
+      <w:r>
+        <w:rPr>
+          <w:rFonts w:cs="Times New Roman"/>
+          <w:szCs w:val="28"/>
+          <w:lang w:val="uk-UA"/>
+        </w:rPr>
+        <w:t>name</w:t>
+      </w:r>
+      <w:proofErr w:type="spellEnd"/>
+      <w:r>
+        <w:rPr>
+          <w:rFonts w:cs="Times New Roman"/>
+          <w:szCs w:val="28"/>
+          <w:lang w:val="uk-UA"/>
+        </w:rPr>
+        <w:t>": "Микола", "</w:t>
+      </w:r>
+      <w:proofErr w:type="spellStart"/>
+      <w:r>
+        <w:rPr>
+          <w:rFonts w:cs="Times New Roman"/>
+          <w:szCs w:val="28"/>
+          <w:lang w:val="uk-UA"/>
+        </w:rPr>
+        <w:t>grade</w:t>
+      </w:r>
+      <w:proofErr w:type="spellEnd"/>
+      <w:r>
+        <w:rPr>
+          <w:rFonts w:cs="Times New Roman"/>
+          <w:szCs w:val="28"/>
+          <w:lang w:val="uk-UA"/>
+        </w:rPr>
+        <w:t>": 12},</w:t>
+      </w:r>
+    </w:p>
+    <w:p>
+      <w:pPr>
+        <w:pBdr>
+          <w:top w:val="single" w:sz="4" w:space="1" w:color="auto"/>
+          <w:left w:val="single" w:sz="4" w:space="4" w:color="auto"/>
+          <w:bottom w:val="single" w:sz="4" w:space="1" w:color="auto"/>
+          <w:right w:val="single" w:sz="4" w:space="4" w:color="auto"/>
+        </w:pBdr>
+        <w:spacing w:after="0"/>
+        <w:rPr>
+          <w:rFonts w:cs="Times New Roman"/>
+          <w:szCs w:val="28"/>
+          <w:lang w:val="uk-UA"/>
+        </w:rPr>
+      </w:pPr>
+      <w:r>
+        <w:rPr>
+          <w:rFonts w:cs="Times New Roman"/>
+          <w:szCs w:val="28"/>
+          <w:lang w:val="uk-UA"/>
+        </w:rPr>
+        <w:t>]</w:t>
+      </w:r>
+    </w:p>
+    <w:p>
+      <w:pPr>
+        <w:pBdr>
+          <w:top w:val="single" w:sz="4" w:space="1" w:color="auto"/>
+          <w:left w:val="single" w:sz="4" w:space="4" w:color="auto"/>
+          <w:bottom w:val="single" w:sz="4" w:space="1" w:color="auto"/>
+          <w:right w:val="single" w:sz="4" w:space="4" w:color="auto"/>
+        </w:pBdr>
+        <w:spacing w:after="0"/>
+        <w:rPr>
+          <w:rFonts w:cs="Times New Roman"/>
+          <w:szCs w:val="28"/>
+          <w:lang w:val="uk-UA"/>
+        </w:rPr>
+      </w:pPr>
+      <w:proofErr w:type="spellStart"/>
+      <w:r>
+        <w:rPr>
+          <w:rFonts w:cs="Times New Roman"/>
+          <w:szCs w:val="28"/>
+          <w:lang w:val="uk-UA"/>
+        </w:rPr>
+        <w:t>print</w:t>
+      </w:r>
+      <w:proofErr w:type="spellEnd"/>
+      <w:r>
+        <w:rPr>
+          <w:rFonts w:cs="Times New Roman"/>
+          <w:szCs w:val="28"/>
+          <w:lang w:val="uk-UA"/>
+        </w:rPr>
+        <w:t>("Початковий список:")</w:t>
+      </w:r>
+    </w:p>
+    <w:p>
+      <w:pPr>
+        <w:pBdr>
+          <w:top w:val="single" w:sz="4" w:space="1" w:color="auto"/>
+          <w:left w:val="single" w:sz="4" w:space="4" w:color="auto"/>
+          <w:bottom w:val="single" w:sz="4" w:space="1" w:color="auto"/>
+          <w:right w:val="single" w:sz="4" w:space="4" w:color="auto"/>
+        </w:pBdr>
+        <w:spacing w:after="0"/>
+        <w:rPr>
+          <w:rFonts w:cs="Times New Roman"/>
+          <w:szCs w:val="28"/>
+          <w:lang w:val="uk-UA"/>
+        </w:rPr>
+      </w:pPr>
+      <w:proofErr w:type="spellStart"/>
+      <w:r>
+        <w:rPr>
+          <w:rFonts w:cs="Times New Roman"/>
+          <w:szCs w:val="28"/>
+          <w:lang w:val="uk-UA"/>
+        </w:rPr>
+        <w:t>print</w:t>
+      </w:r>
+      <w:proofErr w:type="spellEnd"/>
+      <w:r>
+        <w:rPr>
+          <w:rFonts w:cs="Times New Roman"/>
+          <w:szCs w:val="28"/>
+          <w:lang w:val="uk-UA"/>
+        </w:rPr>
+        <w:t>(</w:t>
+      </w:r>
+      <w:proofErr w:type="spellStart"/>
+      <w:r>
+        <w:rPr>
+          <w:rFonts w:cs="Times New Roman"/>
+          <w:szCs w:val="28"/>
+          <w:lang w:val="uk-UA"/>
+        </w:rPr>
+        <w:t>students</w:t>
+      </w:r>
+      <w:proofErr w:type="spellEnd"/>
+      <w:r>
+        <w:rPr>
+          <w:rFonts w:cs="Times New Roman"/>
+          <w:szCs w:val="28"/>
+          <w:lang w:val="uk-UA"/>
+        </w:rPr>
+        <w:t>)</w:t>
+      </w:r>
+    </w:p>
+    <w:p>
+      <w:pPr>
+        <w:pBdr>
+          <w:top w:val="single" w:sz="4" w:space="1" w:color="auto"/>
+          <w:left w:val="single" w:sz="4" w:space="4" w:color="auto"/>
+          <w:bottom w:val="single" w:sz="4" w:space="1" w:color="auto"/>
+          <w:right w:val="single" w:sz="4" w:space="4" w:color="auto"/>
+        </w:pBdr>
+        <w:spacing w:after="0"/>
+        <w:rPr>
+          <w:rFonts w:cs="Times New Roman"/>
+          <w:szCs w:val="28"/>
+          <w:lang w:val="uk-UA"/>
+        </w:rPr>
+      </w:pPr>
+      <w:proofErr w:type="spellStart"/>
+      <w:r>
+        <w:rPr>
+          <w:rFonts w:cs="Times New Roman"/>
+          <w:szCs w:val="28"/>
+          <w:lang w:val="uk-UA"/>
+        </w:rPr>
+        <w:t>locale.setlocale</w:t>
+      </w:r>
+      <w:proofErr w:type="spellEnd"/>
+      <w:r>
+        <w:rPr>
+          <w:rFonts w:cs="Times New Roman"/>
+          <w:szCs w:val="28"/>
+          <w:lang w:val="uk-UA"/>
+        </w:rPr>
+        <w:t>(</w:t>
+      </w:r>
+      <w:proofErr w:type="spellStart"/>
+      <w:r>
+        <w:rPr>
+          <w:rFonts w:cs="Times New Roman"/>
+          <w:szCs w:val="28"/>
+          <w:lang w:val="uk-UA"/>
+        </w:rPr>
+        <w:t>locale.LC_COLLATE</w:t>
+      </w:r>
+      <w:proofErr w:type="spellEnd"/>
+      <w:r>
+        <w:rPr>
+          <w:rFonts w:cs="Times New Roman"/>
+          <w:szCs w:val="28"/>
+          <w:lang w:val="uk-UA"/>
+        </w:rPr>
+        <w:t>, "uk_UA.UTF-8")</w:t>
+      </w:r>
+    </w:p>
+    <w:p>
+      <w:pPr>
+        <w:pBdr>
+          <w:top w:val="single" w:sz="4" w:space="1" w:color="auto"/>
+          <w:left w:val="single" w:sz="4" w:space="4" w:color="auto"/>
+          <w:bottom w:val="single" w:sz="4" w:space="1" w:color="auto"/>
+          <w:right w:val="single" w:sz="4" w:space="4" w:color="auto"/>
+        </w:pBdr>
+        <w:spacing w:after="0"/>
+        <w:rPr>
+          <w:rFonts w:cs="Times New Roman"/>
+          <w:szCs w:val="28"/>
+          <w:lang w:val="uk-UA"/>
+        </w:rPr>
+      </w:pPr>
+      <w:proofErr w:type="spellStart"/>
+      <w:r>
+        <w:rPr>
+          <w:rFonts w:cs="Times New Roman"/>
+          <w:szCs w:val="28"/>
+          <w:lang w:val="uk-UA"/>
+        </w:rPr>
+        <w:t>sorted_name</w:t>
+      </w:r>
+      <w:proofErr w:type="spellEnd"/>
+      <w:r>
+        <w:rPr>
+          <w:rFonts w:cs="Times New Roman"/>
+          <w:szCs w:val="28"/>
+          <w:lang w:val="uk-UA"/>
+        </w:rPr>
+        <w:t xml:space="preserve"> = </w:t>
+      </w:r>
+      <w:proofErr w:type="spellStart"/>
+      <w:r>
+        <w:rPr>
+          <w:rFonts w:cs="Times New Roman"/>
+          <w:szCs w:val="28"/>
+          <w:lang w:val="uk-UA"/>
+        </w:rPr>
+        <w:t>sorted</w:t>
+      </w:r>
+      <w:proofErr w:type="spellEnd"/>
+      <w:r>
+        <w:rPr>
+          <w:rFonts w:cs="Times New Roman"/>
+          <w:szCs w:val="28"/>
+          <w:lang w:val="uk-UA"/>
+        </w:rPr>
+        <w:t>(</w:t>
+      </w:r>
+      <w:proofErr w:type="spellStart"/>
+      <w:r>
+        <w:rPr>
+          <w:rFonts w:cs="Times New Roman"/>
+          <w:szCs w:val="28"/>
+          <w:lang w:val="uk-UA"/>
+        </w:rPr>
+        <w:t>students</w:t>
+      </w:r>
+      <w:proofErr w:type="spellEnd"/>
+      <w:r>
+        <w:rPr>
+          <w:rFonts w:cs="Times New Roman"/>
+          <w:szCs w:val="28"/>
+          <w:lang w:val="uk-UA"/>
+        </w:rPr>
+        <w:t xml:space="preserve">, </w:t>
+      </w:r>
+      <w:proofErr w:type="spellStart"/>
+      <w:r>
+        <w:rPr>
+          <w:rFonts w:cs="Times New Roman"/>
+          <w:szCs w:val="28"/>
+          <w:lang w:val="uk-UA"/>
+        </w:rPr>
+        <w:t>key</w:t>
+      </w:r>
+      <w:proofErr w:type="spellEnd"/>
+      <w:r>
+        <w:rPr>
+          <w:rFonts w:cs="Times New Roman"/>
+          <w:szCs w:val="28"/>
+          <w:lang w:val="uk-UA"/>
+        </w:rPr>
+        <w:t>=</w:t>
+      </w:r>
+      <w:proofErr w:type="spellStart"/>
+      <w:r>
+        <w:rPr>
+          <w:rFonts w:cs="Times New Roman"/>
+          <w:szCs w:val="28"/>
+          <w:lang w:val="uk-UA"/>
+        </w:rPr>
+        <w:t>lambda</w:t>
+      </w:r>
+      <w:proofErr w:type="spellEnd"/>
+      <w:r>
+        <w:rPr>
+          <w:rFonts w:cs="Times New Roman"/>
+          <w:szCs w:val="28"/>
+          <w:lang w:val="uk-UA"/>
+        </w:rPr>
+        <w:t xml:space="preserve"> x: </w:t>
+      </w:r>
+      <w:proofErr w:type="spellStart"/>
+      <w:r>
+        <w:rPr>
+          <w:rFonts w:cs="Times New Roman"/>
+          <w:szCs w:val="28"/>
+          <w:lang w:val="uk-UA"/>
+        </w:rPr>
+        <w:t>locale.strxfrm</w:t>
+      </w:r>
+      <w:proofErr w:type="spellEnd"/>
+      <w:r>
+        <w:rPr>
+          <w:rFonts w:cs="Times New Roman"/>
+          <w:szCs w:val="28"/>
+          <w:lang w:val="uk-UA"/>
+        </w:rPr>
+        <w:t>(x["</w:t>
+      </w:r>
+      <w:proofErr w:type="spellStart"/>
+      <w:r>
+        <w:rPr>
+          <w:rFonts w:cs="Times New Roman"/>
+          <w:szCs w:val="28"/>
+          <w:lang w:val="uk-UA"/>
+        </w:rPr>
+        <w:t>name</w:t>
+      </w:r>
+      <w:proofErr w:type="spellEnd"/>
+      <w:r>
+        <w:rPr>
+          <w:rFonts w:cs="Times New Roman"/>
+          <w:szCs w:val="28"/>
+          <w:lang w:val="uk-UA"/>
+        </w:rPr>
+        <w:t>"]))</w:t>
+      </w:r>
+    </w:p>
+    <w:p>
+      <w:pPr>
+        <w:pBdr>
+          <w:top w:val="single" w:sz="4" w:space="1" w:color="auto"/>
+          <w:left w:val="single" w:sz="4" w:space="4" w:color="auto"/>
+          <w:bottom w:val="single" w:sz="4" w:space="1" w:color="auto"/>
+          <w:right w:val="single" w:sz="4" w:space="4" w:color="auto"/>
+        </w:pBdr>
+        <w:spacing w:after="0"/>
+        <w:rPr>
+          <w:rFonts w:cs="Times New Roman"/>
+          <w:szCs w:val="28"/>
+          <w:lang w:val="uk-UA"/>
+        </w:rPr>
+      </w:pPr>
+      <w:proofErr w:type="spellStart"/>
+      <w:r>
+        <w:rPr>
+          <w:rFonts w:cs="Times New Roman"/>
+          <w:szCs w:val="28"/>
+          <w:lang w:val="uk-UA"/>
+        </w:rPr>
+        <w:t>sorted_grade</w:t>
+      </w:r>
+      <w:proofErr w:type="spellEnd"/>
+      <w:r>
+        <w:rPr>
+          <w:rFonts w:cs="Times New Roman"/>
+          <w:szCs w:val="28"/>
+          <w:lang w:val="uk-UA"/>
+        </w:rPr>
+        <w:t xml:space="preserve"> = </w:t>
+      </w:r>
+      <w:proofErr w:type="spellStart"/>
+      <w:r>
+        <w:rPr>
+          <w:rFonts w:cs="Times New Roman"/>
+          <w:szCs w:val="28"/>
+          <w:lang w:val="uk-UA"/>
+        </w:rPr>
+        <w:t>sorted</w:t>
+      </w:r>
+      <w:proofErr w:type="spellEnd"/>
+      <w:r>
+        <w:rPr>
+          <w:rFonts w:cs="Times New Roman"/>
+          <w:szCs w:val="28"/>
+          <w:lang w:val="uk-UA"/>
+        </w:rPr>
+        <w:t>(</w:t>
+      </w:r>
+      <w:proofErr w:type="spellStart"/>
+      <w:r>
+        <w:rPr>
+          <w:rFonts w:cs="Times New Roman"/>
+          <w:szCs w:val="28"/>
+          <w:lang w:val="uk-UA"/>
+        </w:rPr>
+        <w:t>students</w:t>
+      </w:r>
+      <w:proofErr w:type="spellEnd"/>
+      <w:r>
+        <w:rPr>
+          <w:rFonts w:cs="Times New Roman"/>
+          <w:szCs w:val="28"/>
+          <w:lang w:val="uk-UA"/>
+        </w:rPr>
+        <w:t xml:space="preserve">, </w:t>
+      </w:r>
+      <w:proofErr w:type="spellStart"/>
+      <w:r>
+        <w:rPr>
+          <w:rFonts w:cs="Times New Roman"/>
+          <w:szCs w:val="28"/>
+          <w:lang w:val="uk-UA"/>
+        </w:rPr>
+        <w:t>key</w:t>
+      </w:r>
+      <w:proofErr w:type="spellEnd"/>
+      <w:r>
+        <w:rPr>
+          <w:rFonts w:cs="Times New Roman"/>
+          <w:szCs w:val="28"/>
+          <w:lang w:val="uk-UA"/>
+        </w:rPr>
+        <w:t>=</w:t>
+      </w:r>
+      <w:proofErr w:type="spellStart"/>
+      <w:r>
+        <w:rPr>
+          <w:rFonts w:cs="Times New Roman"/>
+          <w:szCs w:val="28"/>
+          <w:lang w:val="uk-UA"/>
+        </w:rPr>
+        <w:t>lambda</w:t>
+      </w:r>
+      <w:proofErr w:type="spellEnd"/>
+      <w:r>
+        <w:rPr>
+          <w:rFonts w:cs="Times New Roman"/>
+          <w:szCs w:val="28"/>
+          <w:lang w:val="uk-UA"/>
+        </w:rPr>
+        <w:t xml:space="preserve"> x: x["</w:t>
+      </w:r>
+      <w:proofErr w:type="spellStart"/>
+      <w:r>
+        <w:rPr>
+          <w:rFonts w:cs="Times New Roman"/>
+          <w:szCs w:val="28"/>
+          <w:lang w:val="uk-UA"/>
+        </w:rPr>
+        <w:t>grade</w:t>
+      </w:r>
+      <w:proofErr w:type="spellEnd"/>
+      <w:r>
+        <w:rPr>
+          <w:rFonts w:cs="Times New Roman"/>
+          <w:szCs w:val="28"/>
+          <w:lang w:val="uk-UA"/>
+        </w:rPr>
+        <w:t>"])</w:t>
+      </w:r>
+    </w:p>
+    <w:p>
+      <w:pPr>
+        <w:pBdr>
+          <w:top w:val="single" w:sz="4" w:space="1" w:color="auto"/>
+          <w:left w:val="single" w:sz="4" w:space="4" w:color="auto"/>
+          <w:bottom w:val="single" w:sz="4" w:space="1" w:color="auto"/>
+          <w:right w:val="single" w:sz="4" w:space="4" w:color="auto"/>
+        </w:pBdr>
+        <w:spacing w:after="0"/>
+        <w:rPr>
+          <w:rFonts w:cs="Times New Roman"/>
+          <w:szCs w:val="28"/>
+          <w:lang w:val="uk-UA"/>
+        </w:rPr>
+      </w:pPr>
+      <w:proofErr w:type="spellStart"/>
+      <w:r>
+        <w:rPr>
+          <w:rFonts w:cs="Times New Roman"/>
+          <w:szCs w:val="28"/>
+          <w:lang w:val="uk-UA"/>
+        </w:rPr>
+        <w:t>print</w:t>
+      </w:r>
+      <w:proofErr w:type="spellEnd"/>
+      <w:r>
+        <w:rPr>
+          <w:rFonts w:cs="Times New Roman"/>
+          <w:szCs w:val="28"/>
+          <w:lang w:val="uk-UA"/>
+        </w:rPr>
+        <w:t>("\</w:t>
+      </w:r>
+      <w:proofErr w:type="spellStart"/>
+      <w:r>
+        <w:rPr>
+          <w:rFonts w:cs="Times New Roman"/>
+          <w:szCs w:val="28"/>
+          <w:lang w:val="uk-UA"/>
+        </w:rPr>
+        <w:t>nВідсортовано</w:t>
+      </w:r>
+      <w:proofErr w:type="spellEnd"/>
+      <w:r>
+        <w:rPr>
+          <w:rFonts w:cs="Times New Roman"/>
+          <w:szCs w:val="28"/>
+          <w:lang w:val="uk-UA"/>
+        </w:rPr>
+        <w:t xml:space="preserve"> за ім’ям:")</w:t>
+      </w:r>
+    </w:p>
+    <w:p>
+      <w:pPr>
+        <w:pBdr>
+          <w:top w:val="single" w:sz="4" w:space="1" w:color="auto"/>
+          <w:left w:val="single" w:sz="4" w:space="4" w:color="auto"/>
+          <w:bottom w:val="single" w:sz="4" w:space="1" w:color="auto"/>
+          <w:right w:val="single" w:sz="4" w:space="4" w:color="auto"/>
+        </w:pBdr>
+        <w:spacing w:after="0"/>
+        <w:rPr>
+          <w:rFonts w:cs="Times New Roman"/>
+          <w:szCs w:val="28"/>
+          <w:lang w:val="uk-UA"/>
+        </w:rPr>
+      </w:pPr>
+      <w:proofErr w:type="spellStart"/>
+      <w:r>
+        <w:rPr>
+          <w:rFonts w:cs="Times New Roman"/>
+          <w:szCs w:val="28"/>
+          <w:lang w:val="uk-UA"/>
+        </w:rPr>
+        <w:t>print</w:t>
+      </w:r>
+      <w:proofErr w:type="spellEnd"/>
+      <w:r>
+        <w:rPr>
+          <w:rFonts w:cs="Times New Roman"/>
+          <w:szCs w:val="28"/>
+          <w:lang w:val="uk-UA"/>
+        </w:rPr>
+        <w:t>(</w:t>
+      </w:r>
+      <w:proofErr w:type="spellStart"/>
+      <w:r>
+        <w:rPr>
+          <w:rFonts w:cs="Times New Roman"/>
+          <w:szCs w:val="28"/>
+          <w:lang w:val="uk-UA"/>
+        </w:rPr>
+        <w:t>sorted_name</w:t>
+      </w:r>
+      <w:proofErr w:type="spellEnd"/>
+      <w:r>
+        <w:rPr>
+          <w:rFonts w:cs="Times New Roman"/>
+          <w:szCs w:val="28"/>
+          <w:lang w:val="uk-UA"/>
+        </w:rPr>
+        <w:t>)</w:t>
+      </w:r>
+    </w:p>
+    <w:p>
+      <w:pPr>
+        <w:pBdr>
+          <w:top w:val="single" w:sz="4" w:space="1" w:color="auto"/>
+          <w:left w:val="single" w:sz="4" w:space="4" w:color="auto"/>
+          <w:bottom w:val="single" w:sz="4" w:space="1" w:color="auto"/>
+          <w:right w:val="single" w:sz="4" w:space="4" w:color="auto"/>
+        </w:pBdr>
+        <w:spacing w:after="0"/>
+        <w:rPr>
+          <w:rFonts w:cs="Times New Roman"/>
+          <w:szCs w:val="28"/>
+          <w:lang w:val="uk-UA"/>
+        </w:rPr>
+      </w:pPr>
+      <w:proofErr w:type="spellStart"/>
+      <w:r>
+        <w:rPr>
+          <w:rFonts w:cs="Times New Roman"/>
+          <w:szCs w:val="28"/>
+          <w:lang w:val="uk-UA"/>
+        </w:rPr>
+        <w:t>print</w:t>
+      </w:r>
+      <w:proofErr w:type="spellEnd"/>
+      <w:r>
+        <w:rPr>
+          <w:rFonts w:cs="Times New Roman"/>
+          <w:szCs w:val="28"/>
+          <w:lang w:val="uk-UA"/>
+        </w:rPr>
+        <w:t>("\</w:t>
+      </w:r>
+      <w:proofErr w:type="spellStart"/>
+      <w:r>
+        <w:rPr>
+          <w:rFonts w:cs="Times New Roman"/>
+          <w:szCs w:val="28"/>
+          <w:lang w:val="uk-UA"/>
+        </w:rPr>
+        <w:t>nВідсортовано</w:t>
+      </w:r>
+      <w:proofErr w:type="spellEnd"/>
+      <w:r>
+        <w:rPr>
+          <w:rFonts w:cs="Times New Roman"/>
+          <w:szCs w:val="28"/>
+          <w:lang w:val="uk-UA"/>
+        </w:rPr>
+        <w:t xml:space="preserve"> за оцінкою:")</w:t>
+      </w:r>
+    </w:p>
+    <w:p>
+      <w:pPr>
+        <w:pBdr>
+          <w:top w:val="single" w:sz="4" w:space="1" w:color="auto"/>
+          <w:left w:val="single" w:sz="4" w:space="4" w:color="auto"/>
+          <w:bottom w:val="single" w:sz="4" w:space="1" w:color="auto"/>
+          <w:right w:val="single" w:sz="4" w:space="4" w:color="auto"/>
+        </w:pBdr>
+        <w:spacing w:after="0"/>
+        <w:rPr>
+          <w:rFonts w:cs="Times New Roman"/>
+          <w:szCs w:val="28"/>
+          <w:lang w:val="uk-UA"/>
+        </w:rPr>
+      </w:pPr>
+      <w:proofErr w:type="spellStart"/>
+      <w:r>
+        <w:rPr>
+          <w:rFonts w:cs="Times New Roman"/>
+          <w:szCs w:val="28"/>
+          <w:lang w:val="uk-UA"/>
+        </w:rPr>
+        <w:t>print</w:t>
+      </w:r>
+      <w:proofErr w:type="spellEnd"/>
+      <w:r>
+        <w:rPr>
+          <w:rFonts w:cs="Times New Roman"/>
+          <w:szCs w:val="28"/>
+          <w:lang w:val="uk-UA"/>
+        </w:rPr>
+        <w:t>(</w:t>
+      </w:r>
+      <w:proofErr w:type="spellStart"/>
+      <w:r>
+        <w:rPr>
+          <w:rFonts w:cs="Times New Roman"/>
+          <w:szCs w:val="28"/>
+          <w:lang w:val="uk-UA"/>
+        </w:rPr>
+        <w:t>sorted_grade</w:t>
+      </w:r>
+      <w:proofErr w:type="spellEnd"/>
+      <w:r>
+        <w:rPr>
+          <w:rFonts w:cs="Times New Roman"/>
+          <w:szCs w:val="28"/>
+          <w:lang w:val="uk-UA"/>
+        </w:rPr>
+        <w:t>)</w:t>
+      </w:r>
+    </w:p>
+    <w:p>
+      <w:pPr>
+        <w:spacing w:after="0"/>
+        <w:rPr>
+          <w:rFonts w:cs="Times New Roman"/>
+          <w:szCs w:val="28"/>
+          <w:lang w:val="ru-RU"/>
+        </w:rPr>
+      </w:pPr>
+      <w:r>
+        <w:rPr>
+          <w:rFonts w:cs="Times New Roman"/>
+          <w:szCs w:val="28"/>
+          <w:lang w:val="ru-RU"/>
+        </w:rPr>
+        <w:t>Результат:</w:t>
+      </w:r>
+    </w:p>
+    <w:p>
+      <w:pPr>
+        <w:spacing w:after="0"/>
+        <w:rPr>
+          <w:rFonts w:cs="Times New Roman"/>
+          <w:szCs w:val="28"/>
+          <w:lang w:val="ru-RU"/>
+        </w:rPr>
+      </w:pPr>
+      <w:r>
+        <w:rPr>
+          <w:rFonts w:cs="Times New Roman"/>
+          <w:szCs w:val="28"/>
+          <w:lang w:val="ru-RU"/>
+        </w:rPr>
+        <w:drawing>
+          <wp:inline distT="0" distB="0" distL="0" distR="0" wp14:anchorId="151435E3" wp14:editId="605C9A06">
+            <wp:extent cx="5943600" cy="873125"/>
+            <wp:effectExtent l="0" t="0" r="0" b="3175"/>
+            <wp:docPr id="6" name="Рисунок 6"/>
+            <wp:cNvGraphicFramePr>
+              <a:graphicFrameLocks xmlns:a="http://schemas.openxmlformats.org/drawingml/2006/main" noChangeAspect="1"/>
+            </wp:cNvGraphicFramePr>
+            <a:graphic xmlns:a="http://schemas.openxmlformats.org/drawingml/2006/main">
+              <a:graphicData uri="http://schemas.openxmlformats.org/drawingml/2006/picture">
+                <pic:pic xmlns:pic="http://schemas.openxmlformats.org/drawingml/2006/picture">
+                  <pic:nvPicPr>
+                    <pic:cNvPr id="1" name=""/>
+                    <pic:cNvPicPr/>
+                  </pic:nvPicPr>
+                  <pic:blipFill>
+                    <a:blip r:embed="rId25"/>
+                    <a:stretch>
+                      <a:fillRect/>
+                    </a:stretch>
+                  </pic:blipFill>
+                  <pic:spPr>
+                    <a:xfrm>
+                      <a:off x="0" y="0"/>
+                      <a:ext cx="5943600" cy="873125"/>
+                    </a:xfrm>
+                    <a:prstGeom prst="rect">
+                      <a:avLst/>
+                    </a:prstGeom>
+                  </pic:spPr>
+                </pic:pic>
+              </a:graphicData>
+            </a:graphic>
+          </wp:inline>
+        </w:drawing>
+      </w:r>
     </w:p>
     <w:sectPr>
       <w:pgSz w:w="12240" w:h="15840"/>
@@ -16856,6 +21049,95 @@
     </w:lvl>
   </w:abstractNum>
   <w:abstractNum w:abstractNumId="4" w15:restartNumberingAfterBreak="0">
+    <w:nsid w:val="62342268"/>
+    <w:multiLevelType w:val="hybridMultilevel"/>
+    <w:tmpl w:val="F0DA62AE"/>
+    <w:lvl w:ilvl="0" w:tplc="E570A86E">
+      <w:start w:val="1"/>
+      <w:numFmt w:val="decimal"/>
+      <w:lvlText w:val="%1)"/>
+      <w:lvlJc w:val="left"/>
+      <w:pPr>
+        <w:ind w:left="1069" w:hanging="360"/>
+      </w:pPr>
+      <w:rPr>
+        <w:rFonts w:hint="default"/>
+      </w:rPr>
+    </w:lvl>
+    <w:lvl w:ilvl="1" w:tplc="04220019" w:tentative="1">
+      <w:start w:val="1"/>
+      <w:numFmt w:val="lowerLetter"/>
+      <w:lvlText w:val="%2."/>
+      <w:lvlJc w:val="left"/>
+      <w:pPr>
+        <w:ind w:left="1789" w:hanging="360"/>
+      </w:pPr>
+    </w:lvl>
+    <w:lvl w:ilvl="2" w:tplc="0422001B" w:tentative="1">
+      <w:start w:val="1"/>
+      <w:numFmt w:val="lowerRoman"/>
+      <w:lvlText w:val="%3."/>
+      <w:lvlJc w:val="right"/>
+      <w:pPr>
+        <w:ind w:left="2509" w:hanging="180"/>
+      </w:pPr>
+    </w:lvl>
+    <w:lvl w:ilvl="3" w:tplc="0422000F" w:tentative="1">
+      <w:start w:val="1"/>
+      <w:numFmt w:val="decimal"/>
+      <w:lvlText w:val="%4."/>
+      <w:lvlJc w:val="left"/>
+      <w:pPr>
+        <w:ind w:left="3229" w:hanging="360"/>
+      </w:pPr>
+    </w:lvl>
+    <w:lvl w:ilvl="4" w:tplc="04220019" w:tentative="1">
+      <w:start w:val="1"/>
+      <w:numFmt w:val="lowerLetter"/>
+      <w:lvlText w:val="%5."/>
+      <w:lvlJc w:val="left"/>
+      <w:pPr>
+        <w:ind w:left="3949" w:hanging="360"/>
+      </w:pPr>
+    </w:lvl>
+    <w:lvl w:ilvl="5" w:tplc="0422001B" w:tentative="1">
+      <w:start w:val="1"/>
+      <w:numFmt w:val="lowerRoman"/>
+      <w:lvlText w:val="%6."/>
+      <w:lvlJc w:val="right"/>
+      <w:pPr>
+        <w:ind w:left="4669" w:hanging="180"/>
+      </w:pPr>
+    </w:lvl>
+    <w:lvl w:ilvl="6" w:tplc="0422000F" w:tentative="1">
+      <w:start w:val="1"/>
+      <w:numFmt w:val="decimal"/>
+      <w:lvlText w:val="%7."/>
+      <w:lvlJc w:val="left"/>
+      <w:pPr>
+        <w:ind w:left="5389" w:hanging="360"/>
+      </w:pPr>
+    </w:lvl>
+    <w:lvl w:ilvl="7" w:tplc="04220019" w:tentative="1">
+      <w:start w:val="1"/>
+      <w:numFmt w:val="lowerLetter"/>
+      <w:lvlText w:val="%8."/>
+      <w:lvlJc w:val="left"/>
+      <w:pPr>
+        <w:ind w:left="6109" w:hanging="360"/>
+      </w:pPr>
+    </w:lvl>
+    <w:lvl w:ilvl="8" w:tplc="0422001B" w:tentative="1">
+      <w:start w:val="1"/>
+      <w:numFmt w:val="lowerRoman"/>
+      <w:lvlText w:val="%9."/>
+      <w:lvlJc w:val="right"/>
+      <w:pPr>
+        <w:ind w:left="6829" w:hanging="180"/>
+      </w:pPr>
+    </w:lvl>
+  </w:abstractNum>
+  <w:abstractNum w:abstractNumId="5" w15:restartNumberingAfterBreak="0">
     <w:nsid w:val="65BC1C9A"/>
     <w:multiLevelType w:val="hybridMultilevel"/>
     <w:tmpl w:val="F1945C1E"/>
@@ -16944,7 +21226,7 @@
       </w:pPr>
     </w:lvl>
   </w:abstractNum>
-  <w:abstractNum w:abstractNumId="5" w15:restartNumberingAfterBreak="0">
+  <w:abstractNum w:abstractNumId="6" w15:restartNumberingAfterBreak="0">
     <w:nsid w:val="6CE54FE5"/>
     <w:multiLevelType w:val="hybridMultilevel"/>
     <w:tmpl w:val="E6D05908"/>
@@ -17034,7 +21316,7 @@
     </w:lvl>
   </w:abstractNum>
   <w:num w:numId="1">
-    <w:abstractNumId w:val="5"/>
+    <w:abstractNumId w:val="6"/>
   </w:num>
   <w:num w:numId="2">
     <w:abstractNumId w:val="3"/>
@@ -17046,10 +21328,13 @@
     <w:abstractNumId w:val="2"/>
   </w:num>
   <w:num w:numId="5">
-    <w:abstractNumId w:val="4"/>
+    <w:abstractNumId w:val="5"/>
   </w:num>
   <w:num w:numId="6">
     <w:abstractNumId w:val="1"/>
+  </w:num>
+  <w:num w:numId="7">
+    <w:abstractNumId w:val="4"/>
   </w:num>
 </w:numbering>
 </file>
@@ -17515,6 +21800,17 @@
       <w:contextualSpacing/>
     </w:pPr>
   </w:style>
+  <w:style w:type="character" w:styleId="a5">
+    <w:name w:val="Hyperlink"/>
+    <w:basedOn w:val="a0"/>
+    <w:uiPriority w:val="99"/>
+    <w:unhideWhenUsed/>
+    <w:rsid w:val="00AF5BE0"/>
+    <w:rPr>
+      <w:color w:val="0563C1" w:themeColor="hyperlink"/>
+      <w:u w:val="single"/>
+    </w:rPr>
+  </w:style>
 </w:styles>
 </file>
 

</xml_diff>